<commit_message>
poner los try/except inexistentes y hacer pequeños cambios
</commit_message>
<xml_diff>
--- a/documentacion/UT_7_2026_2027.docx
+++ b/documentacion/UT_7_2026_2027.docx
@@ -1309,7 +1309,21 @@
                 <w:rStyle w:val="Hipervnculo"/>
                 <w:noProof/>
               </w:rPr>
-              <w:t>Requerimientos de la aplicación</w:t>
+              <w:t>Requerimientos de l</w:t>
+            </w:r>
+            <w:r>
+              <w:rPr>
+                <w:rStyle w:val="Hipervnculo"/>
+                <w:noProof/>
+              </w:rPr>
+              <w:t>a</w:t>
+            </w:r>
+            <w:r>
+              <w:rPr>
+                <w:rStyle w:val="Hipervnculo"/>
+                <w:noProof/>
+              </w:rPr>
+              <w:t xml:space="preserve"> aplicación</w:t>
             </w:r>
             <w:r>
               <w:rPr>
@@ -6043,9 +6057,9 @@
       </w:r>
     </w:p>
     <w:p/>
-    <w:bookmarkStart w:id="6" w:name="_Toc182500112" w:displacedByCustomXml="next"/>
+    <w:bookmarkStart w:id="6" w:name="_Toc49341785" w:displacedByCustomXml="next"/>
     <w:bookmarkStart w:id="7" w:name="_Toc182218937" w:displacedByCustomXml="next"/>
-    <w:bookmarkStart w:id="8" w:name="_Toc49341785" w:displacedByCustomXml="next"/>
+    <w:bookmarkStart w:id="8" w:name="_Toc182500112" w:displacedByCustomXml="next"/>
     <w:sdt>
       <w:sdtPr>
         <w:rPr>
@@ -7051,28 +7065,15 @@
                   </w:rPr>
                   <w:t xml:space="preserve">oftware draw.io </w:t>
                 </w:r>
-                <w:r>
-                  <w:fldChar w:fldCharType="begin"/>
-                </w:r>
-                <w:r>
-                  <w:rPr>
-                    <w:lang w:val="en-US"/>
-                  </w:rPr>
-                  <w:instrText>HYPERLINK "https://app.diagrams.net/"</w:instrText>
-                </w:r>
-                <w:r>
-                  <w:fldChar w:fldCharType="separate"/>
-                </w:r>
-                <w:r>
-                  <w:rPr>
-                    <w:rStyle w:val="Hipervnculo"/>
-                    <w:lang w:val="en-US"/>
-                  </w:rPr>
-                  <w:t>https://app.diagrams.net/</w:t>
-                </w:r>
-                <w:r>
-                  <w:fldChar w:fldCharType="end"/>
-                </w:r>
+                <w:hyperlink r:id="rId14" w:history="1">
+                  <w:r>
+                    <w:rPr>
+                      <w:rStyle w:val="Hipervnculo"/>
+                      <w:lang w:val="en-US"/>
+                    </w:rPr>
+                    <w:t>https://app.diagrams.net/</w:t>
+                  </w:r>
+                </w:hyperlink>
               </w:p>
             </w:tc>
           </w:tr>
@@ -7320,6 +7321,11 @@
         </w:p>
         <w:p>
           <w:pPr>
+            <w:ind w:firstLine="720"/>
+          </w:pPr>
+        </w:p>
+        <w:p>
+          <w:pPr>
             <w:pStyle w:val="Ttulo3"/>
           </w:pPr>
           <w:bookmarkStart w:id="33" w:name="_Toc49341794"/>
@@ -7396,6 +7402,11 @@
         </w:p>
         <w:p>
           <w:pPr>
+            <w:pStyle w:val="Prrafodelista"/>
+          </w:pPr>
+        </w:p>
+        <w:p>
+          <w:pPr>
             <w:pStyle w:val="Ttulo3"/>
           </w:pPr>
           <w:bookmarkStart w:id="36" w:name="_Toc49341795"/>
@@ -7430,6 +7441,11 @@
         </w:p>
         <w:p>
           <w:pPr>
+            <w:ind w:firstLine="720"/>
+          </w:pPr>
+        </w:p>
+        <w:p>
+          <w:pPr>
             <w:pStyle w:val="Ttulo3"/>
           </w:pPr>
           <w:bookmarkStart w:id="39" w:name="_Toc49341796"/>
@@ -7455,7 +7471,15 @@
               <w:b/>
               <w:bCs/>
             </w:rPr>
-            <w:t>La viabilidad legal está más cuestionada, al necesitar almacenar información de los usuarios en servidores públicos. Según la ley actual deberíamos solicitar permiso a la agencia de protección de datos y dar de alta el fichero. Deberíamos implementar las medidas de seguridad exigidas para un nivel básico y los mecanismos de logs necesarios.</w:t>
+            <w:t xml:space="preserve">La viabilidad legal está más cuestionada, al necesitar almacenar información de los usuarios en servidores públicos. Según la ley actual deberíamos solicitar permiso a la agencia de protección de </w:t>
+          </w:r>
+          <w:r>
+            <w:rPr>
+              <w:b/>
+              <w:bCs/>
+            </w:rPr>
+            <w:lastRenderedPageBreak/>
+            <w:t>datos y dar de alta el fichero. Deberíamos implementar las medidas de seguridad exigidas para un nivel básico y los mecanismos de logs necesarios.</w:t>
           </w:r>
         </w:p>
         <w:p>
@@ -7555,7 +7579,7 @@
                 <o:lock v:ext="edit" aspectratio="t"/>
               </v:shapetype>
               <v:shape id="_x0000_i1025" type="#_x0000_t75" style="width:465.75pt;height:205.3pt">
-                <v:imagedata r:id="rId14" o:title="SecuencaciónFasesProyecto"/>
+                <v:imagedata r:id="rId15" o:title="SecuencaciónFasesProyecto"/>
               </v:shape>
             </w:pict>
           </w:r>
@@ -7582,7 +7606,7 @@
           <w:r>
             <w:pict w14:anchorId="5636CC0F">
               <v:shape id="_x0000_i1026" type="#_x0000_t75" style="width:383.2pt;height:241.8pt">
-                <v:imagedata r:id="rId15" o:title="PlanificaciónRecursosProyectos"/>
+                <v:imagedata r:id="rId16" o:title="PlanificaciónRecursosProyectos"/>
               </v:shape>
             </w:pict>
           </w:r>
@@ -7700,7 +7724,7 @@
                     </pic:cNvPicPr>
                   </pic:nvPicPr>
                   <pic:blipFill>
-                    <a:blip r:embed="rId16">
+                    <a:blip r:embed="rId17">
                       <a:extLst>
                         <a:ext uri="{28A0092B-C50C-407E-A947-70E740481C1C}">
                           <a14:useLocalDpi xmlns:a14="http://schemas.microsoft.com/office/drawing/2010/main" val="0"/>
@@ -7785,7 +7809,7 @@
                     </pic:cNvPicPr>
                   </pic:nvPicPr>
                   <pic:blipFill>
-                    <a:blip r:embed="rId17">
+                    <a:blip r:embed="rId18">
                       <a:extLst>
                         <a:ext uri="{28A0092B-C50C-407E-A947-70E740481C1C}">
                           <a14:useLocalDpi xmlns:a14="http://schemas.microsoft.com/office/drawing/2010/main" val="0"/>
@@ -7859,107 +7883,6 @@
                 <pic:pic xmlns:pic="http://schemas.openxmlformats.org/drawingml/2006/picture">
                   <pic:nvPicPr>
                     <pic:cNvPr id="0" name="Picture 24"/>
-                    <pic:cNvPicPr>
-                      <a:picLocks noChangeAspect="1" noChangeArrowheads="1"/>
-                    </pic:cNvPicPr>
-                  </pic:nvPicPr>
-                  <pic:blipFill>
-                    <a:blip r:embed="rId18">
-                      <a:extLst>
-                        <a:ext uri="{28A0092B-C50C-407E-A947-70E740481C1C}">
-                          <a14:useLocalDpi xmlns:a14="http://schemas.microsoft.com/office/drawing/2010/main" val="0"/>
-                        </a:ext>
-                      </a:extLst>
-                    </a:blip>
-                    <a:srcRect/>
-                    <a:stretch>
-                      <a:fillRect/>
-                    </a:stretch>
-                  </pic:blipFill>
-                  <pic:spPr bwMode="auto">
-                    <a:xfrm>
-                      <a:off x="0" y="0"/>
-                      <a:ext cx="1932305" cy="2303145"/>
-                    </a:xfrm>
-                    <a:prstGeom prst="rect">
-                      <a:avLst/>
-                    </a:prstGeom>
-                    <a:noFill/>
-                    <a:ln>
-                      <a:noFill/>
-                    </a:ln>
-                  </pic:spPr>
-                </pic:pic>
-              </a:graphicData>
-            </a:graphic>
-          </wp:inline>
-        </w:drawing>
-      </w:r>
-    </w:p>
-    <w:p>
-      <w:pPr>
-        <w:spacing w:after="200"/>
-        <w:jc w:val="left"/>
-        <w:rPr>
-          <w:rFonts w:asciiTheme="majorHAnsi" w:eastAsiaTheme="majorEastAsia" w:hAnsiTheme="majorHAnsi" w:cstheme="majorBidi"/>
-          <w:b/>
-          <w:color w:val="012639" w:themeColor="accent1" w:themeShade="7F"/>
-        </w:rPr>
-      </w:pPr>
-      <w:r>
-        <w:br w:type="page"/>
-      </w:r>
-    </w:p>
-    <w:p>
-      <w:pPr>
-        <w:pStyle w:val="Ttulo3"/>
-      </w:pPr>
-      <w:bookmarkStart w:id="65" w:name="_Toc182218957"/>
-      <w:bookmarkStart w:id="66" w:name="_Toc182500132"/>
-      <w:r>
-        <w:lastRenderedPageBreak/>
-        <w:t xml:space="preserve">Dar de </w:t>
-      </w:r>
-      <w:r>
-        <w:t>baja</w:t>
-      </w:r>
-      <w:r>
-        <w:t xml:space="preserve"> guard</w:t>
-      </w:r>
-      <w:r>
-        <w:t>i</w:t>
-      </w:r>
-      <w:r>
-        <w:t xml:space="preserve">as </w:t>
-      </w:r>
-      <w:r>
-        <w:t>(RF5)</w:t>
-      </w:r>
-      <w:bookmarkEnd w:id="65"/>
-      <w:bookmarkEnd w:id="66"/>
-    </w:p>
-    <w:p/>
-    <w:p>
-      <w:pPr>
-        <w:jc w:val="center"/>
-      </w:pPr>
-      <w:r>
-        <w:rPr>
-          <w:noProof/>
-        </w:rPr>
-        <w:drawing>
-          <wp:inline distT="0" distB="0" distL="0" distR="0" wp14:anchorId="6E0521DC" wp14:editId="06446BE0">
-            <wp:extent cx="1932305" cy="2303145"/>
-            <wp:effectExtent l="0" t="0" r="0" b="1905"/>
-            <wp:docPr id="51" name="Imagen 51"/>
-            <wp:cNvGraphicFramePr>
-              <a:graphicFrameLocks xmlns:a="http://schemas.openxmlformats.org/drawingml/2006/main" noChangeAspect="1"/>
-            </wp:cNvGraphicFramePr>
-            <a:graphic xmlns:a="http://schemas.openxmlformats.org/drawingml/2006/main">
-              <a:graphicData uri="http://schemas.openxmlformats.org/drawingml/2006/picture">
-                <pic:pic xmlns:pic="http://schemas.openxmlformats.org/drawingml/2006/picture">
-                  <pic:nvPicPr>
-                    <pic:cNvPr id="0" name="Picture 26"/>
                     <pic:cNvPicPr>
                       <a:picLocks noChangeAspect="1" noChangeArrowheads="1"/>
                     </pic:cNvPicPr>
@@ -7999,6 +7922,107 @@
     </w:p>
     <w:p>
       <w:pPr>
+        <w:spacing w:after="200"/>
+        <w:jc w:val="left"/>
+        <w:rPr>
+          <w:rFonts w:asciiTheme="majorHAnsi" w:eastAsiaTheme="majorEastAsia" w:hAnsiTheme="majorHAnsi" w:cstheme="majorBidi"/>
+          <w:b/>
+          <w:color w:val="012639" w:themeColor="accent1" w:themeShade="7F"/>
+        </w:rPr>
+      </w:pPr>
+      <w:r>
+        <w:br w:type="page"/>
+      </w:r>
+    </w:p>
+    <w:p>
+      <w:pPr>
+        <w:pStyle w:val="Ttulo3"/>
+      </w:pPr>
+      <w:bookmarkStart w:id="65" w:name="_Toc182218957"/>
+      <w:bookmarkStart w:id="66" w:name="_Toc182500132"/>
+      <w:r>
+        <w:lastRenderedPageBreak/>
+        <w:t xml:space="preserve">Dar de </w:t>
+      </w:r>
+      <w:r>
+        <w:t>baja</w:t>
+      </w:r>
+      <w:r>
+        <w:t xml:space="preserve"> guard</w:t>
+      </w:r>
+      <w:r>
+        <w:t>i</w:t>
+      </w:r>
+      <w:r>
+        <w:t xml:space="preserve">as </w:t>
+      </w:r>
+      <w:r>
+        <w:t>(RF5)</w:t>
+      </w:r>
+      <w:bookmarkEnd w:id="65"/>
+      <w:bookmarkEnd w:id="66"/>
+    </w:p>
+    <w:p/>
+    <w:p>
+      <w:pPr>
+        <w:jc w:val="center"/>
+      </w:pPr>
+      <w:r>
+        <w:rPr>
+          <w:noProof/>
+        </w:rPr>
+        <w:drawing>
+          <wp:inline distT="0" distB="0" distL="0" distR="0" wp14:anchorId="6E0521DC" wp14:editId="06446BE0">
+            <wp:extent cx="1932305" cy="2303145"/>
+            <wp:effectExtent l="0" t="0" r="0" b="1905"/>
+            <wp:docPr id="51" name="Imagen 51"/>
+            <wp:cNvGraphicFramePr>
+              <a:graphicFrameLocks xmlns:a="http://schemas.openxmlformats.org/drawingml/2006/main" noChangeAspect="1"/>
+            </wp:cNvGraphicFramePr>
+            <a:graphic xmlns:a="http://schemas.openxmlformats.org/drawingml/2006/main">
+              <a:graphicData uri="http://schemas.openxmlformats.org/drawingml/2006/picture">
+                <pic:pic xmlns:pic="http://schemas.openxmlformats.org/drawingml/2006/picture">
+                  <pic:nvPicPr>
+                    <pic:cNvPr id="0" name="Picture 26"/>
+                    <pic:cNvPicPr>
+                      <a:picLocks noChangeAspect="1" noChangeArrowheads="1"/>
+                    </pic:cNvPicPr>
+                  </pic:nvPicPr>
+                  <pic:blipFill>
+                    <a:blip r:embed="rId20">
+                      <a:extLst>
+                        <a:ext uri="{28A0092B-C50C-407E-A947-70E740481C1C}">
+                          <a14:useLocalDpi xmlns:a14="http://schemas.microsoft.com/office/drawing/2010/main" val="0"/>
+                        </a:ext>
+                      </a:extLst>
+                    </a:blip>
+                    <a:srcRect/>
+                    <a:stretch>
+                      <a:fillRect/>
+                    </a:stretch>
+                  </pic:blipFill>
+                  <pic:spPr bwMode="auto">
+                    <a:xfrm>
+                      <a:off x="0" y="0"/>
+                      <a:ext cx="1932305" cy="2303145"/>
+                    </a:xfrm>
+                    <a:prstGeom prst="rect">
+                      <a:avLst/>
+                    </a:prstGeom>
+                    <a:noFill/>
+                    <a:ln>
+                      <a:noFill/>
+                    </a:ln>
+                  </pic:spPr>
+                </pic:pic>
+              </a:graphicData>
+            </a:graphic>
+          </wp:inline>
+        </w:drawing>
+      </w:r>
+    </w:p>
+    <w:p>
+      <w:pPr>
         <w:pStyle w:val="Ttulo3"/>
       </w:pPr>
       <w:bookmarkStart w:id="67" w:name="_Toc182218958"/>
@@ -8039,7 +8063,7 @@
                     <pic:cNvPicPr/>
                   </pic:nvPicPr>
                   <pic:blipFill>
-                    <a:blip r:embed="rId20">
+                    <a:blip r:embed="rId21">
                       <a:extLst>
                         <a:ext uri="{28A0092B-C50C-407E-A947-70E740481C1C}">
                           <a14:useLocalDpi xmlns:a14="http://schemas.microsoft.com/office/drawing/2010/main" val="0"/>
@@ -8105,7 +8129,7 @@
                     <pic:cNvPicPr/>
                   </pic:nvPicPr>
                   <pic:blipFill>
-                    <a:blip r:embed="rId21">
+                    <a:blip r:embed="rId22">
                       <a:extLst>
                         <a:ext uri="{28A0092B-C50C-407E-A947-70E740481C1C}">
                           <a14:useLocalDpi xmlns:a14="http://schemas.microsoft.com/office/drawing/2010/main" val="0"/>
@@ -11583,7 +11607,7 @@
                     </pic:cNvPicPr>
                   </pic:nvPicPr>
                   <pic:blipFill>
-                    <a:blip r:embed="rId22">
+                    <a:blip r:embed="rId23">
                       <a:extLst>
                         <a:ext uri="{28A0092B-C50C-407E-A947-70E740481C1C}">
                           <a14:useLocalDpi xmlns:a14="http://schemas.microsoft.com/office/drawing/2010/main" val="0"/>
@@ -11686,7 +11710,7 @@
                     </pic:cNvPicPr>
                   </pic:nvPicPr>
                   <pic:blipFill>
-                    <a:blip r:embed="rId23">
+                    <a:blip r:embed="rId24">
                       <a:extLst>
                         <a:ext uri="{28A0092B-C50C-407E-A947-70E740481C1C}">
                           <a14:useLocalDpi xmlns:a14="http://schemas.microsoft.com/office/drawing/2010/main" val="0"/>
@@ -11780,7 +11804,7 @@
       <w:r>
         <w:pict w14:anchorId="119133E6">
           <v:shape id="_x0000_i1027" type="#_x0000_t75" style="width:253.25pt;height:469.4pt">
-            <v:imagedata r:id="rId24" o:title="DA_Login"/>
+            <v:imagedata r:id="rId25" o:title="DA_Login"/>
           </v:shape>
         </w:pict>
       </w:r>
@@ -11810,7 +11834,7 @@
                     </pic:cNvPicPr>
                   </pic:nvPicPr>
                   <pic:blipFill>
-                    <a:blip r:embed="rId25">
+                    <a:blip r:embed="rId26">
                       <a:extLst>
                         <a:ext uri="{28A0092B-C50C-407E-A947-70E740481C1C}">
                           <a14:useLocalDpi xmlns:a14="http://schemas.microsoft.com/office/drawing/2010/main" val="0"/>
@@ -11865,8 +11889,8 @@
       <w:pPr>
         <w:pStyle w:val="Ttulo3"/>
         <w:sectPr>
-          <w:headerReference w:type="default" r:id="rId26"/>
-          <w:footerReference w:type="default" r:id="rId27"/>
+          <w:headerReference w:type="default" r:id="rId27"/>
+          <w:footerReference w:type="default" r:id="rId28"/>
           <w:pgSz w:w="11906" w:h="16838" w:code="9"/>
           <w:pgMar w:top="1291" w:right="936" w:bottom="720" w:left="936" w:header="0" w:footer="289" w:gutter="0"/>
           <w:pgNumType w:start="1"/>
@@ -11928,7 +11952,7 @@
                     </pic:cNvPicPr>
                   </pic:nvPicPr>
                   <pic:blipFill>
-                    <a:blip r:embed="rId28">
+                    <a:blip r:embed="rId29">
                       <a:extLst>
                         <a:ext uri="{28A0092B-C50C-407E-A947-70E740481C1C}">
                           <a14:useLocalDpi xmlns:a14="http://schemas.microsoft.com/office/drawing/2010/main" val="0"/>
@@ -11998,7 +12022,7 @@
                     </pic:cNvPicPr>
                   </pic:nvPicPr>
                   <pic:blipFill>
-                    <a:blip r:embed="rId29">
+                    <a:blip r:embed="rId30">
                       <a:extLst>
                         <a:ext uri="{28A0092B-C50C-407E-A947-70E740481C1C}">
                           <a14:useLocalDpi xmlns:a14="http://schemas.microsoft.com/office/drawing/2010/main" val="0"/>
@@ -12113,7 +12137,7 @@
                     </pic:cNvPicPr>
                   </pic:nvPicPr>
                   <pic:blipFill>
-                    <a:blip r:embed="rId30">
+                    <a:blip r:embed="rId31">
                       <a:extLst>
                         <a:ext uri="{28A0092B-C50C-407E-A947-70E740481C1C}">
                           <a14:useLocalDpi xmlns:a14="http://schemas.microsoft.com/office/drawing/2010/main" val="0"/>
@@ -12187,7 +12211,7 @@
                     </pic:cNvPicPr>
                   </pic:nvPicPr>
                   <pic:blipFill>
-                    <a:blip r:embed="rId31">
+                    <a:blip r:embed="rId32">
                       <a:extLst>
                         <a:ext uri="{28A0092B-C50C-407E-A947-70E740481C1C}">
                           <a14:useLocalDpi xmlns:a14="http://schemas.microsoft.com/office/drawing/2010/main" val="0"/>
@@ -12277,7 +12301,7 @@
                     <pic:cNvPicPr/>
                   </pic:nvPicPr>
                   <pic:blipFill>
-                    <a:blip r:embed="rId32">
+                    <a:blip r:embed="rId33">
                       <a:extLst>
                         <a:ext uri="{28A0092B-C50C-407E-A947-70E740481C1C}">
                           <a14:useLocalDpi xmlns:a14="http://schemas.microsoft.com/office/drawing/2010/main" val="0"/>
@@ -12337,7 +12361,7 @@
                     <pic:cNvPicPr/>
                   </pic:nvPicPr>
                   <pic:blipFill>
-                    <a:blip r:embed="rId33">
+                    <a:blip r:embed="rId34">
                       <a:extLst>
                         <a:ext uri="{28A0092B-C50C-407E-A947-70E740481C1C}">
                           <a14:useLocalDpi xmlns:a14="http://schemas.microsoft.com/office/drawing/2010/main" val="0"/>
@@ -12441,7 +12465,7 @@
                     </pic:cNvPicPr>
                   </pic:nvPicPr>
                   <pic:blipFill>
-                    <a:blip r:embed="rId34">
+                    <a:blip r:embed="rId35">
                       <a:extLst>
                         <a:ext uri="{28A0092B-C50C-407E-A947-70E740481C1C}">
                           <a14:useLocalDpi xmlns:a14="http://schemas.microsoft.com/office/drawing/2010/main" val="0"/>
@@ -16378,7 +16402,6 @@
           <w:color w:val="FF0000"/>
         </w:rPr>
       </w:pPr>
-      <w:bookmarkStart w:id="121" w:name="_Toc49341833"/>
       <w:proofErr w:type="gramStart"/>
       <w:r>
         <w:rPr>
@@ -16394,18 +16417,830 @@
         <w:t>.</w:t>
       </w:r>
     </w:p>
+    <w:p/>
     <w:p>
       <w:pPr>
         <w:pStyle w:val="Ttulo3"/>
       </w:pPr>
-      <w:bookmarkStart w:id="122" w:name="_Toc182218980"/>
-      <w:bookmarkStart w:id="123" w:name="_Toc182500157"/>
-      <w:r>
-        <w:t>Configuración de la aplicación.</w:t>
+      <w:bookmarkStart w:id="121" w:name="_Toc49341831"/>
+      <w:bookmarkStart w:id="122" w:name="_Toc170148358"/>
+      <w:bookmarkStart w:id="123" w:name="_Toc170148673"/>
+      <w:r>
+        <w:t>Estructura de almacenamiento</w:t>
       </w:r>
       <w:bookmarkEnd w:id="121"/>
       <w:bookmarkEnd w:id="122"/>
       <w:bookmarkEnd w:id="123"/>
+    </w:p>
+    <w:p/>
+    <w:p>
+      <w:r>
+        <w:drawing>
+          <wp:anchor distT="0" distB="0" distL="114300" distR="114300" simplePos="0" relativeHeight="251670528" behindDoc="1" locked="0" layoutInCell="1" allowOverlap="1" wp14:anchorId="24A71209" wp14:editId="7D9EBB3E">
+            <wp:simplePos x="0" y="0"/>
+            <wp:positionH relativeFrom="column">
+              <wp:posOffset>0</wp:posOffset>
+            </wp:positionH>
+            <wp:positionV relativeFrom="paragraph">
+              <wp:posOffset>-635</wp:posOffset>
+            </wp:positionV>
+            <wp:extent cx="1767840" cy="2992657"/>
+            <wp:effectExtent l="0" t="0" r="3810" b="0"/>
+            <wp:wrapTight wrapText="bothSides">
+              <wp:wrapPolygon edited="0">
+                <wp:start x="0" y="0"/>
+                <wp:lineTo x="0" y="21453"/>
+                <wp:lineTo x="21414" y="21453"/>
+                <wp:lineTo x="21414" y="0"/>
+                <wp:lineTo x="0" y="0"/>
+              </wp:wrapPolygon>
+            </wp:wrapTight>
+            <wp:docPr id="7432929" name="Imagen 1"/>
+            <wp:cNvGraphicFramePr>
+              <a:graphicFrameLocks xmlns:a="http://schemas.openxmlformats.org/drawingml/2006/main" noChangeAspect="1"/>
+            </wp:cNvGraphicFramePr>
+            <a:graphic xmlns:a="http://schemas.openxmlformats.org/drawingml/2006/main">
+              <a:graphicData uri="http://schemas.openxmlformats.org/drawingml/2006/picture">
+                <pic:pic xmlns:pic="http://schemas.openxmlformats.org/drawingml/2006/picture">
+                  <pic:nvPicPr>
+                    <pic:cNvPr id="7432929" name=""/>
+                    <pic:cNvPicPr/>
+                  </pic:nvPicPr>
+                  <pic:blipFill>
+                    <a:blip r:embed="rId36">
+                      <a:extLst>
+                        <a:ext uri="{28A0092B-C50C-407E-A947-70E740481C1C}">
+                          <a14:useLocalDpi xmlns:a14="http://schemas.microsoft.com/office/drawing/2010/main" val="0"/>
+                        </a:ext>
+                      </a:extLst>
+                    </a:blip>
+                    <a:stretch>
+                      <a:fillRect/>
+                    </a:stretch>
+                  </pic:blipFill>
+                  <pic:spPr>
+                    <a:xfrm>
+                      <a:off x="0" y="0"/>
+                      <a:ext cx="1767840" cy="2992657"/>
+                    </a:xfrm>
+                    <a:prstGeom prst="rect">
+                      <a:avLst/>
+                    </a:prstGeom>
+                  </pic:spPr>
+                </pic:pic>
+              </a:graphicData>
+            </a:graphic>
+          </wp:anchor>
+        </w:drawing>
+      </w:r>
+      <w:r>
+        <w:t xml:space="preserve">La estructura de almacenamiento incluye 8 partes principales. El directorio </w:t>
+      </w:r>
+      <w:r>
+        <w:rPr>
+          <w:b/>
+          <w:bCs/>
+          <w:i/>
+          <w:iCs/>
+        </w:rPr>
+        <w:t>app</w:t>
+      </w:r>
+      <w:r>
+        <w:t xml:space="preserve"> </w:t>
+      </w:r>
+      <w:r>
+        <w:t xml:space="preserve">almacenará la clase </w:t>
+      </w:r>
+      <w:r>
+        <w:rPr>
+          <w:i/>
+          <w:iCs/>
+        </w:rPr>
+        <w:t>App</w:t>
+      </w:r>
+      <w:r>
+        <w:t xml:space="preserve"> y el método </w:t>
+      </w:r>
+      <w:proofErr w:type="spellStart"/>
+      <w:r>
+        <w:rPr>
+          <w:i/>
+          <w:iCs/>
+        </w:rPr>
+        <w:t>main</w:t>
+      </w:r>
+      <w:proofErr w:type="spellEnd"/>
+      <w:r>
+        <w:t>, que representa la suma de todos los métodos y funcionalidades de todos los directorios, y el ejecutable de la aplicación.</w:t>
+      </w:r>
+    </w:p>
+    <w:p/>
+    <w:p>
+      <w:r>
+        <w:t xml:space="preserve">Por otro lado, el directorio </w:t>
+      </w:r>
+      <w:proofErr w:type="spellStart"/>
+      <w:r>
+        <w:rPr>
+          <w:b/>
+          <w:bCs/>
+          <w:i/>
+          <w:iCs/>
+        </w:rPr>
+        <w:t>backups</w:t>
+      </w:r>
+      <w:proofErr w:type="spellEnd"/>
+      <w:r>
+        <w:t xml:space="preserve"> incluirá todas las copias de seguridad que podrá hacer el administrador antes de cargar una nueva base de datos. </w:t>
+      </w:r>
+    </w:p>
+    <w:p/>
+    <w:p>
+      <w:r>
+        <w:t xml:space="preserve">En el directorio </w:t>
+      </w:r>
+      <w:r>
+        <w:rPr>
+          <w:b/>
+          <w:bCs/>
+          <w:i/>
+          <w:iCs/>
+        </w:rPr>
+        <w:t>claves</w:t>
+      </w:r>
+      <w:r>
+        <w:t xml:space="preserve"> se almacenarán todas las claves tanto del administrador como de los profesores. Además, se incluirá un fichero con las credenciales para acceder a la base de datos. </w:t>
+      </w:r>
+    </w:p>
+    <w:p/>
+    <w:p>
+      <w:r>
+        <w:lastRenderedPageBreak/>
+        <w:t xml:space="preserve">Además, en el directorio </w:t>
+      </w:r>
+      <w:r>
+        <w:rPr>
+          <w:b/>
+          <w:bCs/>
+          <w:i/>
+          <w:iCs/>
+        </w:rPr>
+        <w:t>documentación</w:t>
+      </w:r>
+      <w:r>
+        <w:t>, como su nombre indica, se almacenará toda la documentación relativa al proyecto.</w:t>
+      </w:r>
+    </w:p>
+    <w:p/>
+    <w:p>
+      <w:r>
+        <w:t xml:space="preserve">Asimismo, en el directorio </w:t>
+      </w:r>
+      <w:proofErr w:type="spellStart"/>
+      <w:r>
+        <w:rPr>
+          <w:b/>
+          <w:bCs/>
+          <w:i/>
+          <w:iCs/>
+        </w:rPr>
+        <w:t>lib</w:t>
+      </w:r>
+      <w:proofErr w:type="spellEnd"/>
+      <w:r>
+        <w:t xml:space="preserve"> se guardarán todas las clases creadas que coinciden con las tablas de la base de datos, como Profesor, Guardia, Aula, etc.</w:t>
+      </w:r>
+    </w:p>
+    <w:p/>
+    <w:p>
+      <w:r>
+        <w:t xml:space="preserve">En el caso del directorio </w:t>
+      </w:r>
+      <w:proofErr w:type="spellStart"/>
+      <w:r>
+        <w:rPr>
+          <w:b/>
+          <w:bCs/>
+          <w:i/>
+          <w:iCs/>
+        </w:rPr>
+        <w:t>menus</w:t>
+      </w:r>
+      <w:proofErr w:type="spellEnd"/>
+      <w:r>
+        <w:t>, almacenará los menús principales para la gestión de la aplicación, como el menú de inicio, las opciones del administrador y del profesor, etc.</w:t>
+      </w:r>
+    </w:p>
+    <w:p/>
+    <w:p>
+      <w:r>
+        <w:t xml:space="preserve">En </w:t>
+      </w:r>
+      <w:r>
+        <w:rPr>
+          <w:b/>
+          <w:bCs/>
+          <w:i/>
+          <w:iCs/>
+        </w:rPr>
+        <w:t>recursos externo</w:t>
+      </w:r>
+      <w:r>
+        <w:t xml:space="preserve"> se almacenarán por un lado todos los ficheros de datos, de los cuales se van a sacar los datos necesarios sobre los profesores, cursos, aulas y horas. Y, por otro lado, se almacenarán todos los métodos necesarios relacionados con la gestión de la base de datos.</w:t>
+      </w:r>
+    </w:p>
+    <w:p/>
+    <w:p>
+      <w:r>
+        <w:t xml:space="preserve">Y, por último, en el directorio </w:t>
+      </w:r>
+      <w:proofErr w:type="spellStart"/>
+      <w:r>
+        <w:rPr>
+          <w:b/>
+          <w:bCs/>
+          <w:i/>
+          <w:iCs/>
+        </w:rPr>
+        <w:t>tests</w:t>
+      </w:r>
+      <w:proofErr w:type="spellEnd"/>
+      <w:r>
+        <w:t xml:space="preserve"> se guardarán todos los casos de prueba automatizados y divididos en tres bloques: el primer bloque incluye los casos de prueba sobre los métodos presentes en las clases principales del programa almacenadas en el directorio </w:t>
+      </w:r>
+      <w:proofErr w:type="spellStart"/>
+      <w:r>
+        <w:rPr>
+          <w:i/>
+          <w:iCs/>
+        </w:rPr>
+        <w:t>lib</w:t>
+      </w:r>
+      <w:proofErr w:type="spellEnd"/>
+      <w:r>
+        <w:t xml:space="preserve">, el segundo bloque representa los casos de prueba sobre la aplicación final del directorio </w:t>
+      </w:r>
+      <w:r>
+        <w:rPr>
+          <w:i/>
+          <w:iCs/>
+        </w:rPr>
+        <w:t>app</w:t>
+      </w:r>
+      <w:r>
+        <w:t>, y el tercer bloque almacena los casos de prueba de los métodos relacionados con la base de datos.</w:t>
+      </w:r>
+    </w:p>
+    <w:p>
+      <w:pPr>
+        <w:pStyle w:val="Ttulo3"/>
+        <w:spacing w:line="360" w:lineRule="auto"/>
+      </w:pPr>
+      <w:bookmarkStart w:id="124" w:name="_Toc49341833"/>
+      <w:bookmarkStart w:id="125" w:name="_Toc182218980"/>
+      <w:bookmarkStart w:id="126" w:name="_Toc182500157"/>
+    </w:p>
+    <w:p>
+      <w:pPr>
+        <w:pStyle w:val="Ttulo3"/>
+        <w:spacing w:line="360" w:lineRule="auto"/>
+      </w:pPr>
+      <w:r>
+        <w:t>Configuración de la aplicación</w:t>
+      </w:r>
+      <w:bookmarkEnd w:id="124"/>
+      <w:bookmarkEnd w:id="125"/>
+      <w:bookmarkEnd w:id="126"/>
+    </w:p>
+    <w:p>
+      <w:r>
+        <w:t xml:space="preserve">Para la configuración de la aplicación se van a usar tanto ficheros como </w:t>
+      </w:r>
+      <w:r>
+        <w:t>B</w:t>
+      </w:r>
+      <w:r>
+        <w:t xml:space="preserve">ases de </w:t>
+      </w:r>
+      <w:r>
+        <w:t>D</w:t>
+      </w:r>
+      <w:r>
+        <w:t xml:space="preserve">atos. </w:t>
+      </w:r>
+    </w:p>
+    <w:p/>
+    <w:p>
+      <w:r>
+        <w:t>Los ficheros se usar</w:t>
+      </w:r>
+      <w:r>
+        <w:t>á</w:t>
+      </w:r>
+      <w:r>
+        <w:t>n con el objetivo de recoger la información sobre profesores, aulas, cursos y horas</w:t>
+      </w:r>
+      <w:r>
+        <w:t>, con el fin de almacenarlos posteriormente en la Base de Datos. Su formato será .</w:t>
+      </w:r>
+      <w:proofErr w:type="spellStart"/>
+      <w:r>
+        <w:t>txt</w:t>
+      </w:r>
+      <w:proofErr w:type="spellEnd"/>
+      <w:r>
+        <w:t xml:space="preserve"> y .</w:t>
+      </w:r>
+      <w:proofErr w:type="spellStart"/>
+      <w:r>
+        <w:t>csv</w:t>
+      </w:r>
+      <w:proofErr w:type="spellEnd"/>
+      <w:r>
+        <w:t>. Por otro lado, en un fichero .</w:t>
+      </w:r>
+      <w:proofErr w:type="spellStart"/>
+      <w:r>
+        <w:t>py</w:t>
+      </w:r>
+      <w:proofErr w:type="spellEnd"/>
+      <w:r>
+        <w:t xml:space="preserve"> se van a guardar las credenciales del administrador para la gestión y las validaciones internas de la aplicación. Por último, habrá también un fichero con los datos de acceso para los profesores, es decir, el id y la clave de acceso desencriptada de cada profesor. </w:t>
+      </w:r>
+    </w:p>
+    <w:p/>
+    <w:p>
+      <w:r>
+        <w:t xml:space="preserve">En cuanto a la Base de Datos, se usará para almacenar toda la información relativa a las horas, los cursos, las aulas y los profesores. </w:t>
+      </w:r>
+      <w:r>
+        <w:t xml:space="preserve">Las </w:t>
+      </w:r>
+      <w:r>
+        <w:t>claves de acceso de los profesores</w:t>
+      </w:r>
+      <w:r>
+        <w:t xml:space="preserve"> se almacenarán utilizando el algoritmo de </w:t>
+      </w:r>
+      <w:proofErr w:type="spellStart"/>
+      <w:r>
+        <w:t>hashing</w:t>
+      </w:r>
+      <w:proofErr w:type="spellEnd"/>
+      <w:r>
+        <w:t xml:space="preserve"> </w:t>
+      </w:r>
+      <w:proofErr w:type="spellStart"/>
+      <w:r>
+        <w:t>bcrypt</w:t>
+      </w:r>
+      <w:proofErr w:type="spellEnd"/>
+      <w:r>
+        <w:t>.</w:t>
+      </w:r>
+      <w:r>
+        <w:t xml:space="preserve"> Además, aparte de estos datos que se recogerán de los ficheros previamente mencionados, en la Base de datos se almacenarán las guardias creadas y se gestionarán operaciones como su inserción o borrado.</w:t>
+      </w:r>
+    </w:p>
+    <w:p/>
+    <w:p>
+      <w:pPr>
+        <w:pStyle w:val="Ttulo3"/>
+        <w:spacing w:line="360" w:lineRule="auto"/>
+      </w:pPr>
+      <w:bookmarkStart w:id="127" w:name="_Toc49341834"/>
+      <w:bookmarkStart w:id="128" w:name="_Toc182218981"/>
+      <w:bookmarkStart w:id="129" w:name="_Toc182500158"/>
+      <w:r>
+        <w:t>Estructura del fichero de datos</w:t>
+      </w:r>
+      <w:bookmarkStart w:id="130" w:name="_Toc49341837"/>
+      <w:bookmarkEnd w:id="127"/>
+      <w:bookmarkEnd w:id="128"/>
+      <w:bookmarkEnd w:id="129"/>
+    </w:p>
+    <w:p>
+      <w:pPr>
+        <w:rPr>
+          <w:i/>
+          <w:iCs/>
+        </w:rPr>
+      </w:pPr>
+      <w:r>
+        <w:t xml:space="preserve">Los ficheros de datos presentes en la aplicación son los siguientes: </w:t>
+      </w:r>
+      <w:r>
+        <w:rPr>
+          <w:i/>
+          <w:iCs/>
+        </w:rPr>
+        <w:t>aulas.txt, horas.txt, cursos.csv</w:t>
+      </w:r>
+      <w:r>
+        <w:t xml:space="preserve"> y </w:t>
+      </w:r>
+      <w:r>
+        <w:rPr>
+          <w:i/>
+          <w:iCs/>
+        </w:rPr>
+        <w:t xml:space="preserve">profesores.csv. </w:t>
+      </w:r>
+    </w:p>
+    <w:p>
+      <w:pPr>
+        <w:rPr>
+          <w:i/>
+          <w:iCs/>
+        </w:rPr>
+      </w:pPr>
+    </w:p>
+    <w:p>
+      <w:pPr>
+        <w:rPr>
+          <w:i/>
+          <w:iCs/>
+        </w:rPr>
+      </w:pPr>
+      <w:r>
+        <w:t xml:space="preserve">En el caso de los ficheros </w:t>
+      </w:r>
+      <w:r>
+        <w:rPr>
+          <w:i/>
+          <w:iCs/>
+        </w:rPr>
+        <w:t>aulas.txt</w:t>
+      </w:r>
+      <w:r>
+        <w:t xml:space="preserve"> y </w:t>
+      </w:r>
+      <w:r>
+        <w:rPr>
+          <w:i/>
+          <w:iCs/>
+        </w:rPr>
+        <w:t>horas.txt</w:t>
+      </w:r>
+      <w:r>
+        <w:t>, almacenarán los nombres de las aulas y de los cursos de manera similar, ya que cada nombre estará dividido por un salto de línea. En el caso</w:t>
+      </w:r>
+      <w:r>
+        <w:t xml:space="preserve"> </w:t>
+      </w:r>
+      <w:r>
+        <w:t>de la estructura</w:t>
+      </w:r>
+      <w:r>
+        <w:t xml:space="preserve"> del fichero</w:t>
+      </w:r>
+      <w:r>
+        <w:t xml:space="preserve"> </w:t>
+      </w:r>
+      <w:r>
+        <w:rPr>
+          <w:i/>
+          <w:iCs/>
+        </w:rPr>
+        <w:t>cursos.csv</w:t>
+      </w:r>
+      <w:r>
+        <w:t xml:space="preserve">, </w:t>
+      </w:r>
+      <w:r>
+        <w:t xml:space="preserve">los cursos y los grupos van delimitados por comas (,) y, a su vez, cada grupo esta </w:t>
+      </w:r>
+      <w:r>
+        <w:lastRenderedPageBreak/>
+        <w:t xml:space="preserve">delimitado por un punto y coma (;) y los cursos delimitados por saltos de línea, como se puede ver en el siguiente ejemplo: </w:t>
+      </w:r>
+    </w:p>
+    <w:p>
+      <w:pPr>
+        <w:ind w:left="2160"/>
+        <w:jc w:val="left"/>
+        <w:rPr>
+          <w:i/>
+          <w:iCs/>
+        </w:rPr>
+      </w:pPr>
+      <w:r>
+        <w:rPr>
+          <w:i/>
+          <w:iCs/>
+        </w:rPr>
+        <w:t>“</w:t>
+      </w:r>
+      <w:r>
+        <w:rPr>
+          <w:i/>
+          <w:iCs/>
+        </w:rPr>
+        <w:t>1</w:t>
+      </w:r>
+      <w:proofErr w:type="gramStart"/>
+      <w:r>
+        <w:rPr>
+          <w:i/>
+          <w:iCs/>
+        </w:rPr>
+        <w:t>ESO,A</w:t>
+      </w:r>
+      <w:proofErr w:type="gramEnd"/>
+      <w:r>
+        <w:rPr>
+          <w:i/>
+          <w:iCs/>
+        </w:rPr>
+        <w:t>;</w:t>
+      </w:r>
+      <w:proofErr w:type="gramStart"/>
+      <w:r>
+        <w:rPr>
+          <w:i/>
+          <w:iCs/>
+        </w:rPr>
+        <w:t>B;C</w:t>
+      </w:r>
+      <w:proofErr w:type="gramEnd"/>
+      <w:r>
+        <w:rPr>
+          <w:i/>
+          <w:iCs/>
+        </w:rPr>
+        <w:t>;</w:t>
+      </w:r>
+      <w:proofErr w:type="gramStart"/>
+      <w:r>
+        <w:rPr>
+          <w:i/>
+          <w:iCs/>
+        </w:rPr>
+        <w:t>D;E</w:t>
+      </w:r>
+      <w:proofErr w:type="gramEnd"/>
+      <w:r>
+        <w:rPr>
+          <w:i/>
+          <w:iCs/>
+        </w:rPr>
+        <w:br/>
+        <w:t>2</w:t>
+      </w:r>
+      <w:proofErr w:type="gramStart"/>
+      <w:r>
+        <w:rPr>
+          <w:i/>
+          <w:iCs/>
+        </w:rPr>
+        <w:t>ESO,A</w:t>
+      </w:r>
+      <w:proofErr w:type="gramEnd"/>
+      <w:r>
+        <w:rPr>
+          <w:i/>
+          <w:iCs/>
+        </w:rPr>
+        <w:t>;</w:t>
+      </w:r>
+      <w:proofErr w:type="gramStart"/>
+      <w:r>
+        <w:rPr>
+          <w:i/>
+          <w:iCs/>
+        </w:rPr>
+        <w:t>B;C</w:t>
+      </w:r>
+      <w:proofErr w:type="gramEnd"/>
+      <w:r>
+        <w:rPr>
+          <w:i/>
+          <w:iCs/>
+        </w:rPr>
+        <w:t>;</w:t>
+      </w:r>
+      <w:proofErr w:type="gramStart"/>
+      <w:r>
+        <w:rPr>
+          <w:i/>
+          <w:iCs/>
+        </w:rPr>
+        <w:t>D;E</w:t>
+      </w:r>
+      <w:proofErr w:type="gramEnd"/>
+      <w:r>
+        <w:rPr>
+          <w:i/>
+          <w:iCs/>
+        </w:rPr>
+        <w:t>;F</w:t>
+      </w:r>
+      <w:r>
+        <w:rPr>
+          <w:i/>
+          <w:iCs/>
+        </w:rPr>
+        <w:br/>
+        <w:t>3</w:t>
+      </w:r>
+      <w:proofErr w:type="gramStart"/>
+      <w:r>
+        <w:rPr>
+          <w:i/>
+          <w:iCs/>
+        </w:rPr>
+        <w:t>ESO,A</w:t>
+      </w:r>
+      <w:proofErr w:type="gramEnd"/>
+      <w:r>
+        <w:rPr>
+          <w:i/>
+          <w:iCs/>
+        </w:rPr>
+        <w:t>;</w:t>
+      </w:r>
+      <w:proofErr w:type="gramStart"/>
+      <w:r>
+        <w:rPr>
+          <w:i/>
+          <w:iCs/>
+        </w:rPr>
+        <w:t>B;C</w:t>
+      </w:r>
+      <w:proofErr w:type="gramEnd"/>
+      <w:r>
+        <w:rPr>
+          <w:i/>
+          <w:iCs/>
+        </w:rPr>
+        <w:t>”</w:t>
+      </w:r>
+    </w:p>
+    <w:p>
+      <w:pPr>
+        <w:ind w:left="2160"/>
+        <w:jc w:val="left"/>
+        <w:rPr>
+          <w:i/>
+          <w:iCs/>
+        </w:rPr>
+      </w:pPr>
+    </w:p>
+    <w:p>
+      <w:r>
+        <w:t xml:space="preserve">En la base de datos, los cursos se guardarán de la siguiente forma: </w:t>
+      </w:r>
+      <w:proofErr w:type="spellStart"/>
+      <w:r>
+        <w:t>nombre_del_curso</w:t>
+      </w:r>
+      <w:proofErr w:type="spellEnd"/>
+      <w:r>
+        <w:t xml:space="preserve">-grupo. Por último, el fichero </w:t>
+      </w:r>
+      <w:r>
+        <w:rPr>
+          <w:i/>
+          <w:iCs/>
+        </w:rPr>
+        <w:t>profesores.csv</w:t>
+      </w:r>
+      <w:r>
+        <w:t xml:space="preserve"> tendrá un encabezado </w:t>
+      </w:r>
+      <w:r>
+        <w:rPr>
+          <w:i/>
+          <w:iCs/>
+        </w:rPr>
+        <w:t>‘’NOMBRE’’</w:t>
+      </w:r>
+      <w:r>
+        <w:rPr>
+          <w:i/>
+          <w:iCs/>
+        </w:rPr>
+        <w:t xml:space="preserve">, </w:t>
+      </w:r>
+      <w:r>
+        <w:t>después del cual, separados por saltos de línea, vendrán indicados el/los nombres y los apellidos de cada profesor, estando los nombres delimitados por coma (,) de los apellidos. Además, estarán comprendidos entre comillas dobles (“”), como en el siguiente ejemplo:</w:t>
+      </w:r>
+    </w:p>
+    <w:p>
+      <w:pPr>
+        <w:rPr>
+          <w:i/>
+          <w:iCs/>
+        </w:rPr>
+      </w:pPr>
+    </w:p>
+    <w:p>
+      <w:pPr>
+        <w:ind w:left="2160"/>
+        <w:jc w:val="left"/>
+        <w:rPr>
+          <w:i/>
+          <w:iCs/>
+        </w:rPr>
+      </w:pPr>
+      <w:r>
+        <w:rPr>
+          <w:i/>
+          <w:iCs/>
+        </w:rPr>
+        <w:t>"NOMBRE"</w:t>
+      </w:r>
+      <w:r>
+        <w:rPr>
+          <w:i/>
+          <w:iCs/>
+        </w:rPr>
+        <w:br/>
+        <w:t>"Nombre 1, Apellido_1a Apellido_1b"</w:t>
+      </w:r>
+      <w:r>
+        <w:rPr>
+          <w:i/>
+          <w:iCs/>
+        </w:rPr>
+        <w:br/>
+        <w:t>"Nombre2, Apellido_2a Apellido_2b"</w:t>
+      </w:r>
+      <w:r>
+        <w:rPr>
+          <w:i/>
+          <w:iCs/>
+        </w:rPr>
+        <w:br/>
+        <w:t>"Nombre 3, Apellido_3a Apellido_3b"</w:t>
+      </w:r>
+      <w:r>
+        <w:rPr>
+          <w:i/>
+          <w:iCs/>
+        </w:rPr>
+        <w:br/>
+        <w:t>"Nombre 4, de Apellido_4a Apellido_4b"</w:t>
+      </w:r>
+    </w:p>
+    <w:p>
+      <w:pPr>
+        <w:pStyle w:val="Ttulo3"/>
+        <w:spacing w:line="360" w:lineRule="auto"/>
+      </w:pPr>
+      <w:bookmarkStart w:id="131" w:name="_Toc182218982"/>
+      <w:bookmarkStart w:id="132" w:name="_Toc182500159"/>
+    </w:p>
+    <w:p>
+      <w:pPr>
+        <w:pStyle w:val="Ttulo3"/>
+        <w:spacing w:line="360" w:lineRule="auto"/>
+      </w:pPr>
+      <w:proofErr w:type="spellStart"/>
+      <w:r>
+        <w:t>Logout</w:t>
+      </w:r>
+      <w:bookmarkEnd w:id="130"/>
+      <w:bookmarkEnd w:id="131"/>
+      <w:bookmarkEnd w:id="132"/>
+      <w:proofErr w:type="spellEnd"/>
+    </w:p>
+    <w:p>
+      <w:r>
+        <w:t>No aparecerá una ventana específica para cerrar sesión. Sin embargo</w:t>
+      </w:r>
+      <w:r>
+        <w:t>,</w:t>
+      </w:r>
+      <w:r>
+        <w:t xml:space="preserve"> el usuario podrá elegir la opción de “Salir de la aplicación”, que hará automáticamente el </w:t>
+      </w:r>
+      <w:proofErr w:type="spellStart"/>
+      <w:r>
+        <w:t>logout</w:t>
+      </w:r>
+      <w:proofErr w:type="spellEnd"/>
+      <w:r>
+        <w:t xml:space="preserve">.  </w:t>
+      </w:r>
+      <w:r>
+        <w:t>Además, después de cada operación realizada, si el usuario quiere ejecutar otra, tendrá que autentificarse nuevamente.</w:t>
+      </w:r>
+    </w:p>
+    <w:p/>
+    <w:p>
+      <w:pPr>
+        <w:pStyle w:val="Ttulo2"/>
+      </w:pPr>
+      <w:bookmarkStart w:id="133" w:name="_Toc49341838"/>
+      <w:bookmarkStart w:id="134" w:name="_Toc182218983"/>
+      <w:bookmarkStart w:id="135" w:name="_Toc182500160"/>
+      <w:r>
+        <w:t>Diseño de la estructura de clases y librerías (diagrama de clases)</w:t>
+      </w:r>
+      <w:bookmarkEnd w:id="133"/>
+      <w:bookmarkEnd w:id="134"/>
+      <w:bookmarkEnd w:id="135"/>
     </w:p>
     <w:p>
       <w:pPr>
@@ -16419,6 +17254,7 @@
           <w:color w:val="FF0000"/>
         </w:rPr>
       </w:pPr>
+      <w:bookmarkStart w:id="136" w:name="_Toc49341839"/>
       <w:proofErr w:type="gramStart"/>
       <w:r>
         <w:rPr>
@@ -16434,20 +17270,32 @@
         <w:t>.</w:t>
       </w:r>
     </w:p>
-    <w:p/>
     <w:p>
       <w:pPr>
+        <w:pStyle w:val="Ttulo2"/>
+      </w:pPr>
+      <w:bookmarkStart w:id="137" w:name="_Toc182218984"/>
+      <w:bookmarkStart w:id="138" w:name="_Toc182500161"/>
+      <w:r>
+        <w:t>Diseño de la interfaz gráfica</w:t>
+      </w:r>
+      <w:bookmarkStart w:id="139" w:name="_Toc49341840"/>
+      <w:bookmarkEnd w:id="136"/>
+      <w:bookmarkEnd w:id="137"/>
+      <w:bookmarkEnd w:id="138"/>
+    </w:p>
+    <w:p>
+      <w:pPr>
         <w:pStyle w:val="Ttulo3"/>
       </w:pPr>
-      <w:bookmarkStart w:id="124" w:name="_Toc49341834"/>
-      <w:bookmarkStart w:id="125" w:name="_Toc182218981"/>
-      <w:bookmarkStart w:id="126" w:name="_Toc182500158"/>
-      <w:r>
-        <w:t>Estructura del fichero de datos</w:t>
-      </w:r>
-      <w:bookmarkEnd w:id="124"/>
-      <w:bookmarkEnd w:id="125"/>
-      <w:bookmarkEnd w:id="126"/>
+      <w:bookmarkStart w:id="140" w:name="_Toc182218985"/>
+      <w:bookmarkStart w:id="141" w:name="_Toc182500162"/>
+      <w:r>
+        <w:t>Diseño de movimiento de ventanas</w:t>
+      </w:r>
+      <w:bookmarkEnd w:id="139"/>
+      <w:bookmarkEnd w:id="140"/>
+      <w:bookmarkEnd w:id="141"/>
     </w:p>
     <w:p>
       <w:pPr>
@@ -16461,7 +17309,6 @@
           <w:color w:val="FF0000"/>
         </w:rPr>
       </w:pPr>
-      <w:bookmarkStart w:id="127" w:name="_Toc49341837"/>
       <w:proofErr w:type="gramStart"/>
       <w:r>
         <w:rPr>
@@ -16475,22 +17322,37 @@
           <w:color w:val="FF0000"/>
         </w:rPr>
         <w:t>.</w:t>
+      </w:r>
+    </w:p>
+    <w:p/>
+    <w:p>
+      <w:pPr>
+        <w:spacing w:after="200"/>
+        <w:jc w:val="left"/>
+        <w:rPr>
+          <w:rFonts w:asciiTheme="majorHAnsi" w:eastAsiaTheme="majorEastAsia" w:hAnsiTheme="majorHAnsi" w:cstheme="majorBidi"/>
+          <w:b/>
+          <w:color w:val="012639" w:themeColor="accent1" w:themeShade="7F"/>
+        </w:rPr>
+      </w:pPr>
+      <w:r>
+        <w:br w:type="page"/>
       </w:r>
     </w:p>
     <w:p>
       <w:pPr>
         <w:pStyle w:val="Ttulo3"/>
       </w:pPr>
-      <w:bookmarkStart w:id="128" w:name="_Toc182218982"/>
-      <w:bookmarkStart w:id="129" w:name="_Toc182500159"/>
-      <w:proofErr w:type="spellStart"/>
-      <w:r>
-        <w:t>Logout</w:t>
-      </w:r>
-      <w:bookmarkEnd w:id="127"/>
-      <w:bookmarkEnd w:id="128"/>
-      <w:bookmarkEnd w:id="129"/>
-      <w:proofErr w:type="spellEnd"/>
+      <w:bookmarkStart w:id="142" w:name="_Toc49341841"/>
+      <w:bookmarkStart w:id="143" w:name="_Toc182218986"/>
+      <w:bookmarkStart w:id="144" w:name="_Toc182500163"/>
+      <w:r>
+        <w:lastRenderedPageBreak/>
+        <w:t>Diseño de las ventanas</w:t>
+      </w:r>
+      <w:bookmarkEnd w:id="142"/>
+      <w:bookmarkEnd w:id="143"/>
+      <w:bookmarkEnd w:id="144"/>
     </w:p>
     <w:p>
       <w:pPr>
@@ -16519,199 +17381,6 @@
         <w:t>.</w:t>
       </w:r>
     </w:p>
-    <w:p/>
-    <w:p>
-      <w:pPr>
-        <w:pStyle w:val="Ttulo2"/>
-      </w:pPr>
-      <w:bookmarkStart w:id="130" w:name="_Toc49341838"/>
-      <w:bookmarkStart w:id="131" w:name="_Toc182218983"/>
-      <w:bookmarkStart w:id="132" w:name="_Toc182500160"/>
-      <w:r>
-        <w:t>Diseño de la estructura de clases y librerías (diagrama de clases)</w:t>
-      </w:r>
-      <w:bookmarkEnd w:id="130"/>
-      <w:bookmarkEnd w:id="131"/>
-      <w:bookmarkEnd w:id="132"/>
-    </w:p>
-    <w:p>
-      <w:pPr>
-        <w:pBdr>
-          <w:top w:val="single" w:sz="4" w:space="1" w:color="FF0000"/>
-          <w:left w:val="single" w:sz="4" w:space="4" w:color="FF0000"/>
-          <w:bottom w:val="single" w:sz="4" w:space="1" w:color="FF0000"/>
-          <w:right w:val="single" w:sz="4" w:space="4" w:color="FF0000"/>
-        </w:pBdr>
-        <w:rPr>
-          <w:color w:val="FF0000"/>
-        </w:rPr>
-      </w:pPr>
-      <w:bookmarkStart w:id="133" w:name="_Toc49341839"/>
-      <w:proofErr w:type="gramStart"/>
-      <w:r>
-        <w:rPr>
-          <w:color w:val="FF0000"/>
-        </w:rPr>
-        <w:t>Hacer….</w:t>
-      </w:r>
-      <w:proofErr w:type="gramEnd"/>
-      <w:r>
-        <w:rPr>
-          <w:color w:val="FF0000"/>
-        </w:rPr>
-        <w:t>.</w:t>
-      </w:r>
-    </w:p>
-    <w:p>
-      <w:pPr>
-        <w:pStyle w:val="Ttulo2"/>
-      </w:pPr>
-      <w:bookmarkStart w:id="134" w:name="_Toc182218984"/>
-      <w:bookmarkStart w:id="135" w:name="_Toc182500161"/>
-      <w:r>
-        <w:t>Diseño de la interfaz gráfica</w:t>
-      </w:r>
-      <w:bookmarkEnd w:id="133"/>
-      <w:bookmarkEnd w:id="134"/>
-      <w:bookmarkEnd w:id="135"/>
-    </w:p>
-    <w:p>
-      <w:pPr>
-        <w:pBdr>
-          <w:top w:val="single" w:sz="4" w:space="1" w:color="FF0000"/>
-          <w:left w:val="single" w:sz="4" w:space="4" w:color="FF0000"/>
-          <w:bottom w:val="single" w:sz="4" w:space="1" w:color="FF0000"/>
-          <w:right w:val="single" w:sz="4" w:space="4" w:color="FF0000"/>
-        </w:pBdr>
-        <w:rPr>
-          <w:color w:val="FF0000"/>
-        </w:rPr>
-      </w:pPr>
-      <w:bookmarkStart w:id="136" w:name="_Toc49341840"/>
-      <w:proofErr w:type="gramStart"/>
-      <w:r>
-        <w:rPr>
-          <w:color w:val="FF0000"/>
-        </w:rPr>
-        <w:t>Hacer….</w:t>
-      </w:r>
-      <w:proofErr w:type="gramEnd"/>
-      <w:r>
-        <w:rPr>
-          <w:color w:val="FF0000"/>
-        </w:rPr>
-        <w:t>.</w:t>
-      </w:r>
-    </w:p>
-    <w:p>
-      <w:pPr>
-        <w:pStyle w:val="Ttulo3"/>
-      </w:pPr>
-      <w:bookmarkStart w:id="137" w:name="_Toc182218985"/>
-      <w:bookmarkStart w:id="138" w:name="_Toc182500162"/>
-      <w:r>
-        <w:t>Diseño de movimiento de ventanas</w:t>
-      </w:r>
-      <w:bookmarkEnd w:id="136"/>
-      <w:bookmarkEnd w:id="137"/>
-      <w:bookmarkEnd w:id="138"/>
-    </w:p>
-    <w:p>
-      <w:pPr>
-        <w:pBdr>
-          <w:top w:val="single" w:sz="4" w:space="1" w:color="FF0000"/>
-          <w:left w:val="single" w:sz="4" w:space="4" w:color="FF0000"/>
-          <w:bottom w:val="single" w:sz="4" w:space="1" w:color="FF0000"/>
-          <w:right w:val="single" w:sz="4" w:space="4" w:color="FF0000"/>
-        </w:pBdr>
-        <w:rPr>
-          <w:color w:val="FF0000"/>
-        </w:rPr>
-      </w:pPr>
-      <w:proofErr w:type="gramStart"/>
-      <w:r>
-        <w:rPr>
-          <w:color w:val="FF0000"/>
-        </w:rPr>
-        <w:t>Hacer….</w:t>
-      </w:r>
-      <w:proofErr w:type="gramEnd"/>
-      <w:r>
-        <w:rPr>
-          <w:color w:val="FF0000"/>
-        </w:rPr>
-        <w:t>.</w:t>
-      </w:r>
-    </w:p>
-    <w:p/>
-    <w:p>
-      <w:pPr>
-        <w:spacing w:after="200"/>
-        <w:jc w:val="left"/>
-        <w:rPr>
-          <w:rFonts w:asciiTheme="majorHAnsi" w:eastAsiaTheme="majorEastAsia" w:hAnsiTheme="majorHAnsi" w:cstheme="majorBidi"/>
-          <w:b/>
-          <w:color w:val="012639" w:themeColor="accent1" w:themeShade="7F"/>
-        </w:rPr>
-      </w:pPr>
-      <w:r>
-        <w:br w:type="page"/>
-      </w:r>
-    </w:p>
-    <w:p>
-      <w:pPr>
-        <w:pStyle w:val="Ttulo3"/>
-      </w:pPr>
-      <w:bookmarkStart w:id="139" w:name="_Toc49341841"/>
-      <w:bookmarkStart w:id="140" w:name="_Toc182218986"/>
-      <w:bookmarkStart w:id="141" w:name="_Toc182500163"/>
-      <w:r>
-        <w:lastRenderedPageBreak/>
-        <w:t>Diseño de las ventanas</w:t>
-      </w:r>
-      <w:bookmarkEnd w:id="139"/>
-      <w:bookmarkEnd w:id="140"/>
-      <w:bookmarkEnd w:id="141"/>
-    </w:p>
-    <w:p>
-      <w:pPr>
-        <w:pBdr>
-          <w:top w:val="single" w:sz="4" w:space="1" w:color="FF0000"/>
-          <w:left w:val="single" w:sz="4" w:space="4" w:color="FF0000"/>
-          <w:bottom w:val="single" w:sz="4" w:space="1" w:color="FF0000"/>
-          <w:right w:val="single" w:sz="4" w:space="4" w:color="FF0000"/>
-        </w:pBdr>
-        <w:rPr>
-          <w:color w:val="FF0000"/>
-        </w:rPr>
-      </w:pPr>
-      <w:proofErr w:type="gramStart"/>
-      <w:r>
-        <w:rPr>
-          <w:color w:val="FF0000"/>
-        </w:rPr>
-        <w:t>Hacer….</w:t>
-      </w:r>
-      <w:proofErr w:type="gramEnd"/>
-      <w:r>
-        <w:rPr>
-          <w:color w:val="FF0000"/>
-        </w:rPr>
-        <w:t>.</w:t>
-      </w:r>
-    </w:p>
-    <w:p>
-      <w:pPr>
-        <w:pStyle w:val="Ttulo4"/>
-      </w:pPr>
-      <w:bookmarkStart w:id="142" w:name="_Toc49341842"/>
-      <w:bookmarkStart w:id="143" w:name="_Toc182500164"/>
-      <w:r>
-        <w:t>Ventana de bienvenida</w:t>
-      </w:r>
-      <w:bookmarkEnd w:id="142"/>
-      <w:bookmarkEnd w:id="143"/>
-    </w:p>
     <w:p>
       <w:r>
         <w:rPr>
@@ -16721,170 +17390,7 @@
         <mc:AlternateContent>
           <mc:Choice Requires="wps">
             <w:drawing>
-              <wp:anchor distT="0" distB="0" distL="114300" distR="114300" simplePos="0" relativeHeight="251667456" behindDoc="0" locked="0" layoutInCell="1" allowOverlap="1" wp14:anchorId="58AEECB5" wp14:editId="49BBC733">
-                <wp:simplePos x="0" y="0"/>
-                <wp:positionH relativeFrom="column">
-                  <wp:posOffset>635</wp:posOffset>
-                </wp:positionH>
-                <wp:positionV relativeFrom="paragraph">
-                  <wp:posOffset>1957705</wp:posOffset>
-                </wp:positionV>
-                <wp:extent cx="3059430" cy="635"/>
-                <wp:effectExtent l="0" t="0" r="0" b="0"/>
-                <wp:wrapSquare wrapText="bothSides"/>
-                <wp:docPr id="25" name="Cuadro de texto 25"/>
-                <wp:cNvGraphicFramePr/>
-                <a:graphic xmlns:a="http://schemas.openxmlformats.org/drawingml/2006/main">
-                  <a:graphicData uri="http://schemas.microsoft.com/office/word/2010/wordprocessingShape">
-                    <wps:wsp>
-                      <wps:cNvSpPr txBox="1"/>
-                      <wps:spPr>
-                        <a:xfrm>
-                          <a:off x="0" y="0"/>
-                          <a:ext cx="3059430" cy="635"/>
-                        </a:xfrm>
-                        <a:prstGeom prst="rect">
-                          <a:avLst/>
-                        </a:prstGeom>
-                        <a:solidFill>
-                          <a:prstClr val="white"/>
-                        </a:solidFill>
-                        <a:ln>
-                          <a:noFill/>
-                        </a:ln>
-                      </wps:spPr>
-                      <wps:txbx>
-                        <w:txbxContent>
-                          <w:p>
-                            <w:pPr>
-                              <w:pStyle w:val="Descripcin"/>
-                              <w:rPr>
-                                <w:sz w:val="24"/>
-                                <w:szCs w:val="24"/>
-                              </w:rPr>
-                            </w:pPr>
-                            <w:bookmarkStart w:id="144" w:name="_Toc181034207"/>
-                            <w:r>
-                              <w:t xml:space="preserve">Ilustración </w:t>
-                            </w:r>
-                            <w:r>
-                              <w:rPr>
-                                <w:noProof/>
-                              </w:rPr>
-                              <w:fldChar w:fldCharType="begin"/>
-                            </w:r>
-                            <w:r>
-                              <w:rPr>
-                                <w:noProof/>
-                              </w:rPr>
-                              <w:instrText xml:space="preserve"> SEQ Ilustración \* ARABIC </w:instrText>
-                            </w:r>
-                            <w:r>
-                              <w:rPr>
-                                <w:noProof/>
-                              </w:rPr>
-                              <w:fldChar w:fldCharType="separate"/>
-                            </w:r>
-                            <w:r>
-                              <w:rPr>
-                                <w:noProof/>
-                              </w:rPr>
-                              <w:t>1</w:t>
-                            </w:r>
-                            <w:r>
-                              <w:rPr>
-                                <w:noProof/>
-                              </w:rPr>
-                              <w:fldChar w:fldCharType="end"/>
-                            </w:r>
-                            <w:r>
-                              <w:t xml:space="preserve"> - Ventana a (Bienvenida)</w:t>
-                            </w:r>
-                            <w:bookmarkEnd w:id="144"/>
-                          </w:p>
-                        </w:txbxContent>
-                      </wps:txbx>
-                      <wps:bodyPr rot="0" spcFirstLastPara="0" vertOverflow="overflow" horzOverflow="overflow" vert="horz" wrap="square" lIns="0" tIns="0" rIns="0" bIns="0" numCol="1" spcCol="0" rtlCol="0" fromWordArt="0" anchor="t" anchorCtr="0" forceAA="0" compatLnSpc="1">
-                        <a:prstTxWarp prst="textNoShape">
-                          <a:avLst/>
-                        </a:prstTxWarp>
-                        <a:spAutoFit/>
-                      </wps:bodyPr>
-                    </wps:wsp>
-                  </a:graphicData>
-                </a:graphic>
-              </wp:anchor>
-            </w:drawing>
-          </mc:Choice>
-          <mc:Fallback>
-            <w:pict>
-              <v:shape w14:anchorId="58AEECB5" id="Cuadro de texto 25" o:spid="_x0000_s1029" type="#_x0000_t202" style="position:absolute;left:0;text-align:left;margin-left:.05pt;margin-top:154.15pt;width:240.9pt;height:.05pt;z-index:251667456;visibility:visible;mso-wrap-style:square;mso-wrap-distance-left:9pt;mso-wrap-distance-top:0;mso-wrap-distance-right:9pt;mso-wrap-distance-bottom:0;mso-position-horizontal:absolute;mso-position-horizontal-relative:text;mso-position-vertical:absolute;mso-position-vertical-relative:text;v-text-anchor:top" o:gfxdata="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" stroked="f">
-                <v:textbox style="mso-fit-shape-to-text:t" inset="0,0,0,0">
-                  <w:txbxContent>
-                    <w:p>
-                      <w:pPr>
-                        <w:pStyle w:val="Descripcin"/>
-                        <w:rPr>
-                          <w:sz w:val="24"/>
-                          <w:szCs w:val="24"/>
-                        </w:rPr>
-                      </w:pPr>
-                      <w:bookmarkStart w:id="145" w:name="_Toc181034207"/>
-                      <w:r>
-                        <w:t xml:space="preserve">Ilustración </w:t>
-                      </w:r>
-                      <w:r>
-                        <w:rPr>
-                          <w:noProof/>
-                        </w:rPr>
-                        <w:fldChar w:fldCharType="begin"/>
-                      </w:r>
-                      <w:r>
-                        <w:rPr>
-                          <w:noProof/>
-                        </w:rPr>
-                        <w:instrText xml:space="preserve"> SEQ Ilustración \* ARABIC </w:instrText>
-                      </w:r>
-                      <w:r>
-                        <w:rPr>
-                          <w:noProof/>
-                        </w:rPr>
-                        <w:fldChar w:fldCharType="separate"/>
-                      </w:r>
-                      <w:r>
-                        <w:rPr>
-                          <w:noProof/>
-                        </w:rPr>
-                        <w:t>1</w:t>
-                      </w:r>
-                      <w:r>
-                        <w:rPr>
-                          <w:noProof/>
-                        </w:rPr>
-                        <w:fldChar w:fldCharType="end"/>
-                      </w:r>
-                      <w:r>
-                        <w:t xml:space="preserve"> - Ventana a (Bienvenida)</w:t>
-                      </w:r>
-                      <w:bookmarkEnd w:id="145"/>
-                    </w:p>
-                  </w:txbxContent>
-                </v:textbox>
-                <w10:wrap type="square"/>
-              </v:shape>
-            </w:pict>
-          </mc:Fallback>
-        </mc:AlternateContent>
-      </w:r>
-      <w:r>
-        <w:rPr>
-          <w:noProof/>
-          <w:lang w:eastAsia="es-ES"/>
-        </w:rPr>
-        <mc:AlternateContent>
-          <mc:Choice Requires="wps">
-            <w:drawing>
-              <wp:anchor distT="0" distB="0" distL="114300" distR="114300" simplePos="0" relativeHeight="251669504" behindDoc="0" locked="0" layoutInCell="1" allowOverlap="1" wp14:anchorId="400C2738" wp14:editId="540AD95D">
+              <wp:anchor distT="0" distB="0" distL="114300" distR="114300" simplePos="0" relativeHeight="251669504" behindDoc="0" locked="0" layoutInCell="1" allowOverlap="1" wp14:anchorId="400C2738" wp14:editId="553FFDA5">
                 <wp:simplePos x="0" y="0"/>
                 <wp:positionH relativeFrom="column">
                   <wp:posOffset>3183890</wp:posOffset>
@@ -16926,53 +17432,6 @@
                                 <w:szCs w:val="24"/>
                               </w:rPr>
                             </w:pPr>
-                            <w:bookmarkStart w:id="145" w:name="_Toc181034208"/>
-                            <w:r>
-                              <w:t xml:space="preserve">Ilustración </w:t>
-                            </w:r>
-                            <w:r>
-                              <w:rPr>
-                                <w:noProof/>
-                              </w:rPr>
-                              <w:fldChar w:fldCharType="begin"/>
-                            </w:r>
-                            <w:r>
-                              <w:rPr>
-                                <w:noProof/>
-                              </w:rPr>
-                              <w:instrText xml:space="preserve"> SEQ Ilustración \* ARABIC </w:instrText>
-                            </w:r>
-                            <w:r>
-                              <w:rPr>
-                                <w:noProof/>
-                              </w:rPr>
-                              <w:fldChar w:fldCharType="separate"/>
-                            </w:r>
-                            <w:r>
-                              <w:rPr>
-                                <w:noProof/>
-                              </w:rPr>
-                              <w:t>2</w:t>
-                            </w:r>
-                            <w:r>
-                              <w:rPr>
-                                <w:noProof/>
-                              </w:rPr>
-                              <w:fldChar w:fldCharType="end"/>
-                            </w:r>
-                            <w:r>
-                              <w:t xml:space="preserve"> </w:t>
-                            </w:r>
-                            <w:r>
-                              <w:t xml:space="preserve">- Ventana </w:t>
-                            </w:r>
-                            <w:r>
-                              <w:t>b</w:t>
-                            </w:r>
-                            <w:r>
-                              <w:t xml:space="preserve"> (Bienvenida)</w:t>
-                            </w:r>
-                            <w:bookmarkEnd w:id="145"/>
                           </w:p>
                         </w:txbxContent>
                       </wps:txbx>
@@ -16990,7 +17449,7 @@
           </mc:Choice>
           <mc:Fallback>
             <w:pict>
-              <v:shape w14:anchorId="400C2738" id="Cuadro de texto 26" o:spid="_x0000_s1030" type="#_x0000_t202" style="position:absolute;left:0;text-align:left;margin-left:250.7pt;margin-top:153.45pt;width:240.9pt;height:.05pt;z-index:251669504;visibility:visible;mso-wrap-style:square;mso-wrap-distance-left:9pt;mso-wrap-distance-top:0;mso-wrap-distance-right:9pt;mso-wrap-distance-bottom:0;mso-position-horizontal:absolute;mso-position-horizontal-relative:text;mso-position-vertical:absolute;mso-position-vertical-relative:text;v-text-anchor:top" o:gfxdata="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" stroked="f">
+              <v:shape w14:anchorId="400C2738" id="Cuadro de texto 26" o:spid="_x0000_s1029" type="#_x0000_t202" style="position:absolute;left:0;text-align:left;margin-left:250.7pt;margin-top:153.45pt;width:240.9pt;height:.05pt;z-index:251669504;visibility:visible;mso-wrap-style:square;mso-wrap-distance-left:9pt;mso-wrap-distance-top:0;mso-wrap-distance-right:9pt;mso-wrap-distance-bottom:0;mso-position-horizontal:absolute;mso-position-horizontal-relative:text;mso-position-vertical:absolute;mso-position-vertical-relative:text;v-text-anchor:top" o:gfxdata="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" stroked="f">
                 <v:textbox style="mso-fit-shape-to-text:t" inset="0,0,0,0">
                   <w:txbxContent>
                     <w:p>
@@ -17001,53 +17460,6 @@
                           <w:szCs w:val="24"/>
                         </w:rPr>
                       </w:pPr>
-                      <w:bookmarkStart w:id="147" w:name="_Toc181034208"/>
-                      <w:r>
-                        <w:t xml:space="preserve">Ilustración </w:t>
-                      </w:r>
-                      <w:r>
-                        <w:rPr>
-                          <w:noProof/>
-                        </w:rPr>
-                        <w:fldChar w:fldCharType="begin"/>
-                      </w:r>
-                      <w:r>
-                        <w:rPr>
-                          <w:noProof/>
-                        </w:rPr>
-                        <w:instrText xml:space="preserve"> SEQ Ilustración \* ARABIC </w:instrText>
-                      </w:r>
-                      <w:r>
-                        <w:rPr>
-                          <w:noProof/>
-                        </w:rPr>
-                        <w:fldChar w:fldCharType="separate"/>
-                      </w:r>
-                      <w:r>
-                        <w:rPr>
-                          <w:noProof/>
-                        </w:rPr>
-                        <w:t>2</w:t>
-                      </w:r>
-                      <w:r>
-                        <w:rPr>
-                          <w:noProof/>
-                        </w:rPr>
-                        <w:fldChar w:fldCharType="end"/>
-                      </w:r>
-                      <w:r>
-                        <w:t xml:space="preserve"> </w:t>
-                      </w:r>
-                      <w:r>
-                        <w:t xml:space="preserve">- Ventana </w:t>
-                      </w:r>
-                      <w:r>
-                        <w:t>b</w:t>
-                      </w:r>
-                      <w:r>
-                        <w:t xml:space="preserve"> (Bienvenida)</w:t>
-                      </w:r>
-                      <w:bookmarkEnd w:id="147"/>
                     </w:p>
                   </w:txbxContent>
                 </v:textbox>
@@ -17079,9 +17491,9 @@
           <w:szCs w:val="144"/>
         </w:rPr>
       </w:pPr>
-      <w:bookmarkStart w:id="146" w:name="_Toc49341857"/>
-      <w:bookmarkStart w:id="147" w:name="_Toc182218987"/>
-      <w:bookmarkStart w:id="148" w:name="_Toc182500165"/>
+      <w:bookmarkStart w:id="145" w:name="_Toc49341857"/>
+      <w:bookmarkStart w:id="146" w:name="_Toc182218987"/>
+      <w:bookmarkStart w:id="147" w:name="_Toc182500165"/>
       <w:r>
         <w:rPr>
           <w:sz w:val="144"/>
@@ -17090,9 +17502,9 @@
         <w:lastRenderedPageBreak/>
         <w:t>Implementar el proyecto</w:t>
       </w:r>
+      <w:bookmarkEnd w:id="145"/>
       <w:bookmarkEnd w:id="146"/>
       <w:bookmarkEnd w:id="147"/>
-      <w:bookmarkEnd w:id="148"/>
     </w:p>
     <w:p>
       <w:pPr>
@@ -17113,12 +17525,12 @@
       <w:pPr>
         <w:pStyle w:val="Ttulo3"/>
       </w:pPr>
-      <w:bookmarkStart w:id="149" w:name="_Toc49341830"/>
-      <w:bookmarkStart w:id="150" w:name="_Toc182218978"/>
-      <w:bookmarkStart w:id="151" w:name="_Toc182500155"/>
-      <w:bookmarkStart w:id="152" w:name="_Toc49341858"/>
-      <w:bookmarkStart w:id="153" w:name="_Toc182218988"/>
-      <w:bookmarkStart w:id="154" w:name="_Toc182500166"/>
+      <w:bookmarkStart w:id="148" w:name="_Toc49341830"/>
+      <w:bookmarkStart w:id="149" w:name="_Toc182218978"/>
+      <w:bookmarkStart w:id="150" w:name="_Toc182500155"/>
+      <w:bookmarkStart w:id="151" w:name="_Toc49341858"/>
+      <w:bookmarkStart w:id="152" w:name="_Toc182218988"/>
+      <w:bookmarkStart w:id="153" w:name="_Toc182500166"/>
       <w:proofErr w:type="spellStart"/>
       <w:r>
         <w:lastRenderedPageBreak/>
@@ -17128,9 +17540,9 @@
       <w:r>
         <w:t xml:space="preserve"> de creación (MySQL)</w:t>
       </w:r>
+      <w:bookmarkEnd w:id="148"/>
       <w:bookmarkEnd w:id="149"/>
       <w:bookmarkEnd w:id="150"/>
-      <w:bookmarkEnd w:id="151"/>
     </w:p>
     <w:p>
       <w:pPr>
@@ -18754,9 +19166,9 @@
         <w:lastRenderedPageBreak/>
         <w:t>Indicadores de calidad</w:t>
       </w:r>
+      <w:bookmarkEnd w:id="151"/>
       <w:bookmarkEnd w:id="152"/>
       <w:bookmarkEnd w:id="153"/>
-      <w:bookmarkEnd w:id="154"/>
     </w:p>
     <w:tbl>
       <w:tblPr>
@@ -22599,16 +23011,16 @@
       <w:pPr>
         <w:pStyle w:val="Ttulo2"/>
       </w:pPr>
-      <w:bookmarkStart w:id="155" w:name="_Toc49341859"/>
-      <w:bookmarkStart w:id="156" w:name="_Toc182218989"/>
-      <w:bookmarkStart w:id="157" w:name="_Toc182500167"/>
+      <w:bookmarkStart w:id="154" w:name="_Toc49341859"/>
+      <w:bookmarkStart w:id="155" w:name="_Toc182218989"/>
+      <w:bookmarkStart w:id="156" w:name="_Toc182500167"/>
       <w:r>
         <w:lastRenderedPageBreak/>
         <w:t>Elaboración de una batería de pruebas para detectar errores</w:t>
       </w:r>
+      <w:bookmarkEnd w:id="154"/>
       <w:bookmarkEnd w:id="155"/>
       <w:bookmarkEnd w:id="156"/>
-      <w:bookmarkEnd w:id="157"/>
     </w:p>
     <w:p>
       <w:r>
@@ -23383,20 +23795,20 @@
       </w:tr>
     </w:tbl>
     <w:p>
-      <w:bookmarkStart w:id="158" w:name="_Toc49341860"/>
+      <w:bookmarkStart w:id="157" w:name="_Toc49341860"/>
     </w:p>
     <w:p>
       <w:pPr>
         <w:pStyle w:val="Ttulo2"/>
       </w:pPr>
-      <w:bookmarkStart w:id="159" w:name="_Toc182218990"/>
-      <w:bookmarkStart w:id="160" w:name="_Toc182500168"/>
+      <w:bookmarkStart w:id="158" w:name="_Toc182218990"/>
+      <w:bookmarkStart w:id="159" w:name="_Toc182500168"/>
       <w:r>
         <w:t>Evaluación y solución de incidencias</w:t>
       </w:r>
+      <w:bookmarkEnd w:id="157"/>
       <w:bookmarkEnd w:id="158"/>
       <w:bookmarkEnd w:id="159"/>
-      <w:bookmarkEnd w:id="160"/>
     </w:p>
     <w:p>
       <w:pPr>
@@ -23430,18 +23842,18 @@
       <w:pPr>
         <w:pStyle w:val="Ttulo2"/>
       </w:pPr>
-      <w:bookmarkStart w:id="161" w:name="_Toc49341861"/>
-      <w:bookmarkStart w:id="162" w:name="_Toc182218991"/>
-      <w:bookmarkStart w:id="163" w:name="_Toc182500169"/>
+      <w:bookmarkStart w:id="160" w:name="_Toc49341861"/>
+      <w:bookmarkStart w:id="161" w:name="_Toc182218991"/>
+      <w:bookmarkStart w:id="162" w:name="_Toc182500169"/>
       <w:r>
         <w:t>Evaluación y seguimiento del</w:t>
       </w:r>
       <w:r>
         <w:t xml:space="preserve"> proyecto</w:t>
       </w:r>
+      <w:bookmarkEnd w:id="160"/>
       <w:bookmarkEnd w:id="161"/>
       <w:bookmarkEnd w:id="162"/>
-      <w:bookmarkEnd w:id="163"/>
     </w:p>
     <w:p>
       <w:pPr>
@@ -23475,9 +23887,9 @@
       <w:pPr>
         <w:pStyle w:val="Ttulo2"/>
       </w:pPr>
-      <w:bookmarkStart w:id="164" w:name="_Toc49341862"/>
-      <w:bookmarkStart w:id="165" w:name="_Toc182218992"/>
-      <w:bookmarkStart w:id="166" w:name="_Toc182500170"/>
+      <w:bookmarkStart w:id="163" w:name="_Toc49341862"/>
+      <w:bookmarkStart w:id="164" w:name="_Toc182218992"/>
+      <w:bookmarkStart w:id="165" w:name="_Toc182500170"/>
       <w:r>
         <w:t xml:space="preserve">Implementación de la BBDD bajo </w:t>
       </w:r>
@@ -23485,9 +23897,9 @@
       <w:r>
         <w:t>Mysql</w:t>
       </w:r>
+      <w:bookmarkEnd w:id="163"/>
       <w:bookmarkEnd w:id="164"/>
       <w:bookmarkEnd w:id="165"/>
-      <w:bookmarkEnd w:id="166"/>
       <w:proofErr w:type="spellEnd"/>
     </w:p>
     <w:p>
@@ -23561,7 +23973,7 @@
           <w:szCs w:val="144"/>
         </w:rPr>
       </w:pPr>
-      <w:bookmarkStart w:id="167" w:name="_Toc49341863"/>
+      <w:bookmarkStart w:id="166" w:name="_Toc49341863"/>
       <w:r>
         <w:rPr>
           <w:sz w:val="144"/>
@@ -23579,8 +23991,8 @@
           <w:szCs w:val="144"/>
         </w:rPr>
       </w:pPr>
-      <w:bookmarkStart w:id="168" w:name="_Toc182218993"/>
-      <w:bookmarkStart w:id="169" w:name="_Toc182500171"/>
+      <w:bookmarkStart w:id="167" w:name="_Toc182218993"/>
+      <w:bookmarkStart w:id="168" w:name="_Toc182500171"/>
       <w:r>
         <w:rPr>
           <w:sz w:val="144"/>
@@ -23589,9 +24001,9 @@
         <w:lastRenderedPageBreak/>
         <w:t>Implantación del Proyecto</w:t>
       </w:r>
+      <w:bookmarkEnd w:id="166"/>
       <w:bookmarkEnd w:id="167"/>
       <w:bookmarkEnd w:id="168"/>
-      <w:bookmarkEnd w:id="169"/>
     </w:p>
     <w:p>
       <w:pPr>
@@ -23612,16 +24024,16 @@
       <w:pPr>
         <w:pStyle w:val="Ttulo2"/>
       </w:pPr>
-      <w:bookmarkStart w:id="170" w:name="_Toc49341864"/>
-      <w:bookmarkStart w:id="171" w:name="_Toc182218994"/>
-      <w:bookmarkStart w:id="172" w:name="_Toc182500172"/>
+      <w:bookmarkStart w:id="169" w:name="_Toc49341864"/>
+      <w:bookmarkStart w:id="170" w:name="_Toc182218994"/>
+      <w:bookmarkStart w:id="171" w:name="_Toc182500172"/>
       <w:r>
         <w:lastRenderedPageBreak/>
         <w:t>Plan de implantación</w:t>
       </w:r>
+      <w:bookmarkEnd w:id="169"/>
       <w:bookmarkEnd w:id="170"/>
       <w:bookmarkEnd w:id="171"/>
-      <w:bookmarkEnd w:id="172"/>
     </w:p>
     <w:p>
       <w:r>
@@ -23935,15 +24347,15 @@
       <w:pPr>
         <w:pStyle w:val="Ttulo2"/>
       </w:pPr>
-      <w:bookmarkStart w:id="173" w:name="_Toc49341865"/>
-      <w:bookmarkStart w:id="174" w:name="_Toc182218995"/>
-      <w:bookmarkStart w:id="175" w:name="_Toc182500173"/>
+      <w:bookmarkStart w:id="172" w:name="_Toc49341865"/>
+      <w:bookmarkStart w:id="173" w:name="_Toc182218995"/>
+      <w:bookmarkStart w:id="174" w:name="_Toc182500173"/>
       <w:r>
         <w:t>Manual de instalación</w:t>
       </w:r>
+      <w:bookmarkEnd w:id="172"/>
       <w:bookmarkEnd w:id="173"/>
       <w:bookmarkEnd w:id="174"/>
-      <w:bookmarkEnd w:id="175"/>
     </w:p>
     <w:p>
       <w:pPr>
@@ -23977,17 +24389,17 @@
       <w:pPr>
         <w:pStyle w:val="Ttulo3"/>
       </w:pPr>
-      <w:bookmarkStart w:id="176" w:name="_Toc37610656"/>
-      <w:bookmarkStart w:id="177" w:name="_Toc49341866"/>
-      <w:bookmarkStart w:id="178" w:name="_Toc182218996"/>
-      <w:bookmarkStart w:id="179" w:name="_Toc182500174"/>
+      <w:bookmarkStart w:id="175" w:name="_Toc37610656"/>
+      <w:bookmarkStart w:id="176" w:name="_Toc49341866"/>
+      <w:bookmarkStart w:id="177" w:name="_Toc182218996"/>
+      <w:bookmarkStart w:id="178" w:name="_Toc182500174"/>
       <w:r>
         <w:t>Instalación de la aplicación</w:t>
       </w:r>
+      <w:bookmarkEnd w:id="175"/>
       <w:bookmarkEnd w:id="176"/>
       <w:bookmarkEnd w:id="177"/>
       <w:bookmarkEnd w:id="178"/>
-      <w:bookmarkEnd w:id="179"/>
     </w:p>
     <w:p>
       <w:pPr>
@@ -24001,7 +24413,7 @@
           <w:color w:val="FF0000"/>
         </w:rPr>
       </w:pPr>
-      <w:bookmarkStart w:id="180" w:name="_Toc49341876"/>
+      <w:bookmarkStart w:id="179" w:name="_Toc49341876"/>
       <w:proofErr w:type="gramStart"/>
       <w:r>
         <w:rPr>
@@ -24021,72 +24433,152 @@
       <w:pPr>
         <w:pStyle w:val="Ttulo2"/>
       </w:pPr>
-      <w:bookmarkStart w:id="181" w:name="_Toc182218997"/>
-      <w:bookmarkStart w:id="182" w:name="_Toc182500175"/>
+      <w:bookmarkStart w:id="180" w:name="_Toc182218997"/>
+      <w:bookmarkStart w:id="181" w:name="_Toc182500175"/>
       <w:r>
         <w:t>Mejoras posibles</w:t>
       </w:r>
+      <w:bookmarkEnd w:id="179"/>
       <w:bookmarkEnd w:id="180"/>
       <w:bookmarkEnd w:id="181"/>
-      <w:bookmarkEnd w:id="182"/>
     </w:p>
     <w:p>
       <w:pPr>
-        <w:pBdr>
-          <w:top w:val="single" w:sz="4" w:space="1" w:color="FF0000"/>
-          <w:left w:val="single" w:sz="4" w:space="4" w:color="FF0000"/>
-          <w:bottom w:val="single" w:sz="4" w:space="1" w:color="FF0000"/>
-          <w:right w:val="single" w:sz="4" w:space="4" w:color="FF0000"/>
-        </w:pBdr>
-        <w:rPr>
-          <w:color w:val="FF0000"/>
-        </w:rPr>
-      </w:pPr>
-      <w:proofErr w:type="gramStart"/>
-      <w:r>
-        <w:rPr>
-          <w:color w:val="FF0000"/>
-        </w:rPr>
-        <w:t>Hacer….</w:t>
-      </w:r>
-      <w:proofErr w:type="gramEnd"/>
-      <w:r>
-        <w:rPr>
-          <w:color w:val="FF0000"/>
-        </w:rPr>
-        <w:t>.</w:t>
-      </w:r>
-    </w:p>
-    <w:p/>
-    <w:p>
-      <w:pPr>
-        <w:spacing w:after="200"/>
-        <w:jc w:val="left"/>
-        <w:rPr>
-          <w:rFonts w:eastAsiaTheme="majorEastAsia" w:cstheme="majorBidi"/>
-          <w:b/>
-          <w:sz w:val="36"/>
-          <w:szCs w:val="26"/>
-        </w:rPr>
-      </w:pPr>
-      <w:r>
-        <w:br w:type="page"/>
+        <w:pStyle w:val="Prrafodelista"/>
+        <w:numPr>
+          <w:ilvl w:val="0"/>
+          <w:numId w:val="15"/>
+        </w:numPr>
+        <w:rPr>
+          <w:lang w:val="en-US"/>
+        </w:rPr>
+      </w:pPr>
+      <w:r>
+        <w:t xml:space="preserve">A lo largo de la implementación se realizaron cambios sobre la base de datos ya que se detecto la necesidad de añadir una restricción para no permitir insertar guardias los fines de semana. La restricción implementada ha sido la siguiente: </w:t>
       </w:r>
     </w:p>
     <w:p>
       <w:pPr>
+        <w:pStyle w:val="Prrafodelista"/>
+        <w:rPr>
+          <w:b/>
+          <w:bCs/>
+          <w:lang w:val="en-US"/>
+        </w:rPr>
+      </w:pPr>
+      <w:r>
+        <w:rPr>
+          <w:b/>
+          <w:bCs/>
+          <w:lang w:val="en-US"/>
+        </w:rPr>
+        <w:t xml:space="preserve">ALTER TABLE </w:t>
+      </w:r>
+      <w:proofErr w:type="spellStart"/>
+      <w:r>
+        <w:rPr>
+          <w:b/>
+          <w:bCs/>
+          <w:lang w:val="en-US"/>
+        </w:rPr>
+        <w:t>guardias</w:t>
+      </w:r>
+      <w:proofErr w:type="spellEnd"/>
+      <w:r>
+        <w:rPr>
+          <w:b/>
+          <w:bCs/>
+          <w:lang w:val="en-US"/>
+        </w:rPr>
+        <w:t xml:space="preserve"> ADD CONSTRAINT </w:t>
+      </w:r>
+      <w:proofErr w:type="spellStart"/>
+      <w:r>
+        <w:rPr>
+          <w:b/>
+          <w:bCs/>
+          <w:lang w:val="en-US"/>
+        </w:rPr>
+        <w:t>chk_fecha_guardia</w:t>
+      </w:r>
+      <w:proofErr w:type="spellEnd"/>
+      <w:r>
+        <w:rPr>
+          <w:b/>
+          <w:bCs/>
+          <w:lang w:val="en-US"/>
+        </w:rPr>
+        <w:t xml:space="preserve"> </w:t>
+      </w:r>
+      <w:proofErr w:type="gramStart"/>
+      <w:r>
+        <w:rPr>
+          <w:b/>
+          <w:bCs/>
+          <w:lang w:val="en-US"/>
+        </w:rPr>
+        <w:t>CHECK(</w:t>
+      </w:r>
+      <w:proofErr w:type="spellStart"/>
+      <w:proofErr w:type="gramEnd"/>
+      <w:r>
+        <w:rPr>
+          <w:b/>
+          <w:bCs/>
+          <w:lang w:val="en-US"/>
+        </w:rPr>
+        <w:t>dayofweek</w:t>
+      </w:r>
+      <w:proofErr w:type="spellEnd"/>
+      <w:r>
+        <w:rPr>
+          <w:b/>
+          <w:bCs/>
+          <w:lang w:val="en-US"/>
+        </w:rPr>
+        <w:t>(</w:t>
+      </w:r>
+      <w:proofErr w:type="spellStart"/>
+      <w:r>
+        <w:rPr>
+          <w:b/>
+          <w:bCs/>
+          <w:lang w:val="en-US"/>
+        </w:rPr>
+        <w:t>dia</w:t>
+      </w:r>
+      <w:proofErr w:type="spellEnd"/>
+      <w:r>
+        <w:rPr>
+          <w:b/>
+          <w:bCs/>
+          <w:lang w:val="en-US"/>
+        </w:rPr>
+        <w:t>) not in (1,7)).</w:t>
+      </w:r>
+      <w:r>
+        <w:rPr>
+          <w:b/>
+          <w:bCs/>
+          <w:lang w:val="en-US"/>
+        </w:rPr>
+        <w:br w:type="page"/>
+      </w:r>
+    </w:p>
+    <w:p>
+      <w:pPr>
         <w:pStyle w:val="Ttulo2"/>
       </w:pPr>
-      <w:bookmarkStart w:id="183" w:name="_Toc49341877"/>
-      <w:bookmarkStart w:id="184" w:name="_Toc182218998"/>
-      <w:bookmarkStart w:id="185" w:name="_Toc182500176"/>
+      <w:bookmarkStart w:id="182" w:name="_Toc49341877"/>
+      <w:bookmarkStart w:id="183" w:name="_Toc182218998"/>
+      <w:bookmarkStart w:id="184" w:name="_Toc182500176"/>
       <w:r>
         <w:lastRenderedPageBreak/>
         <w:t>Manual de usuario</w:t>
       </w:r>
+      <w:bookmarkEnd w:id="182"/>
       <w:bookmarkEnd w:id="183"/>
       <w:bookmarkEnd w:id="184"/>
-      <w:bookmarkEnd w:id="185"/>
     </w:p>
     <w:p>
       <w:pPr>
@@ -24098,9 +24590,9 @@
           <w:lang w:bidi="es-ES"/>
         </w:rPr>
       </w:pPr>
-      <w:bookmarkStart w:id="186" w:name="_Toc49341895"/>
-      <w:bookmarkStart w:id="187" w:name="_Toc182218999"/>
-      <w:bookmarkStart w:id="188" w:name="_Toc182500177"/>
+      <w:bookmarkStart w:id="185" w:name="_Toc49341895"/>
+      <w:bookmarkStart w:id="186" w:name="_Toc182218999"/>
+      <w:bookmarkStart w:id="187" w:name="_Toc182500177"/>
       <w:r>
         <w:rPr>
           <w:sz w:val="144"/>
@@ -24109,9 +24601,9 @@
         </w:rPr>
         <w:t>Anexos</w:t>
       </w:r>
+      <w:bookmarkEnd w:id="185"/>
       <w:bookmarkEnd w:id="186"/>
       <w:bookmarkEnd w:id="187"/>
-      <w:bookmarkEnd w:id="188"/>
     </w:p>
     <w:sdt>
       <w:sdtPr>
@@ -24157,9 +24649,9 @@
               <w:b w:val="0"/>
             </w:rPr>
           </w:pPr>
-          <w:bookmarkStart w:id="189" w:name="_Toc49341896"/>
-          <w:bookmarkStart w:id="190" w:name="_Toc182219000"/>
-          <w:bookmarkStart w:id="191" w:name="_Toc182500178"/>
+          <w:bookmarkStart w:id="188" w:name="_Toc49341896"/>
+          <w:bookmarkStart w:id="189" w:name="_Toc182219000"/>
+          <w:bookmarkStart w:id="190" w:name="_Toc182500178"/>
           <w:r>
             <w:rPr>
               <w:b w:val="0"/>
@@ -24167,15 +24659,15 @@
             <w:lastRenderedPageBreak/>
             <w:t xml:space="preserve">Formulario </w:t>
           </w:r>
-          <w:bookmarkEnd w:id="189"/>
+          <w:bookmarkEnd w:id="188"/>
           <w:r>
             <w:rPr>
               <w:b w:val="0"/>
             </w:rPr>
             <w:t>actual para la gestión de guardias</w:t>
           </w:r>
+          <w:bookmarkEnd w:id="189"/>
           <w:bookmarkEnd w:id="190"/>
-          <w:bookmarkEnd w:id="191"/>
         </w:p>
         <w:p>
           <w:pPr>
@@ -24205,7 +24697,7 @@
                         </pic:cNvPicPr>
                       </pic:nvPicPr>
                       <pic:blipFill>
-                        <a:blip r:embed="rId35" cstate="print">
+                        <a:blip r:embed="rId37" cstate="print">
                           <a:extLst>
                             <a:ext uri="{28A0092B-C50C-407E-A947-70E740481C1C}">
                               <a14:useLocalDpi xmlns:a14="http://schemas.microsoft.com/office/drawing/2010/main" val="0"/>
@@ -24245,8 +24737,8 @@
               <w:b w:val="0"/>
             </w:rPr>
           </w:pPr>
-          <w:bookmarkStart w:id="192" w:name="_Toc182219001"/>
-          <w:bookmarkStart w:id="193" w:name="_Toc182500179"/>
+          <w:bookmarkStart w:id="191" w:name="_Toc182219001"/>
+          <w:bookmarkStart w:id="192" w:name="_Toc182500179"/>
           <w:r>
             <w:rPr>
               <w:b w:val="0"/>
@@ -24268,7 +24760,30 @@
             </w:rPr>
             <w:t xml:space="preserve"> (alumnos)</w:t>
           </w:r>
+          <w:bookmarkEnd w:id="191"/>
           <w:bookmarkEnd w:id="192"/>
+        </w:p>
+        <w:p>
+          <w:pPr>
+            <w:pStyle w:val="Ttulo2"/>
+            <w:spacing w:after="0"/>
+            <w:rPr>
+              <w:rFonts w:eastAsiaTheme="minorEastAsia" w:cstheme="minorBidi"/>
+              <w:b w:val="0"/>
+              <w:sz w:val="24"/>
+              <w:szCs w:val="24"/>
+            </w:rPr>
+          </w:pPr>
+          <w:bookmarkStart w:id="193" w:name="_Toc182500180"/>
+          <w:r>
+            <w:rPr>
+              <w:rFonts w:eastAsiaTheme="minorEastAsia" w:cstheme="minorBidi"/>
+              <w:b w:val="0"/>
+              <w:sz w:val="24"/>
+              <w:szCs w:val="24"/>
+            </w:rPr>
+            <w:t>"NOMBRE"</w:t>
+          </w:r>
           <w:bookmarkEnd w:id="193"/>
         </w:p>
         <w:p>
@@ -24282,30 +24797,7 @@
               <w:szCs w:val="24"/>
             </w:rPr>
           </w:pPr>
-          <w:bookmarkStart w:id="194" w:name="_Toc182500180"/>
-          <w:r>
-            <w:rPr>
-              <w:rFonts w:eastAsiaTheme="minorEastAsia" w:cstheme="minorBidi"/>
-              <w:b w:val="0"/>
-              <w:sz w:val="24"/>
-              <w:szCs w:val="24"/>
-            </w:rPr>
-            <w:t>"NOMBRE"</w:t>
-          </w:r>
-          <w:bookmarkEnd w:id="194"/>
-        </w:p>
-        <w:p>
-          <w:pPr>
-            <w:pStyle w:val="Ttulo2"/>
-            <w:spacing w:after="0"/>
-            <w:rPr>
-              <w:rFonts w:eastAsiaTheme="minorEastAsia" w:cstheme="minorBidi"/>
-              <w:b w:val="0"/>
-              <w:sz w:val="24"/>
-              <w:szCs w:val="24"/>
-            </w:rPr>
-          </w:pPr>
-          <w:bookmarkStart w:id="195" w:name="_Toc182500181"/>
+          <w:bookmarkStart w:id="194" w:name="_Toc182500181"/>
           <w:r>
             <w:rPr>
               <w:rFonts w:eastAsiaTheme="minorEastAsia" w:cstheme="minorBidi"/>
@@ -24351,7 +24843,7 @@
             </w:rPr>
             <w:t>"</w:t>
           </w:r>
-          <w:bookmarkEnd w:id="195"/>
+          <w:bookmarkEnd w:id="194"/>
         </w:p>
         <w:p>
           <w:pPr>
@@ -24364,7 +24856,7 @@
               <w:szCs w:val="24"/>
             </w:rPr>
           </w:pPr>
-          <w:bookmarkStart w:id="196" w:name="_Toc182500182"/>
+          <w:bookmarkStart w:id="195" w:name="_Toc182500182"/>
           <w:r>
             <w:rPr>
               <w:rFonts w:eastAsiaTheme="minorEastAsia" w:cstheme="minorBidi"/>
@@ -24410,7 +24902,7 @@
             </w:rPr>
             <w:t>"</w:t>
           </w:r>
-          <w:bookmarkEnd w:id="196"/>
+          <w:bookmarkEnd w:id="195"/>
         </w:p>
         <w:p>
           <w:pPr>
@@ -24423,7 +24915,7 @@
               <w:szCs w:val="24"/>
             </w:rPr>
           </w:pPr>
-          <w:bookmarkStart w:id="197" w:name="_Toc182500183"/>
+          <w:bookmarkStart w:id="196" w:name="_Toc182500183"/>
           <w:r>
             <w:rPr>
               <w:rFonts w:eastAsiaTheme="minorEastAsia" w:cstheme="minorBidi"/>
@@ -24469,7 +24961,7 @@
             </w:rPr>
             <w:t>"</w:t>
           </w:r>
-          <w:bookmarkEnd w:id="197"/>
+          <w:bookmarkEnd w:id="196"/>
         </w:p>
         <w:p>
           <w:pPr>
@@ -24482,7 +24974,7 @@
               <w:szCs w:val="24"/>
             </w:rPr>
           </w:pPr>
-          <w:bookmarkStart w:id="198" w:name="_Toc182500184"/>
+          <w:bookmarkStart w:id="197" w:name="_Toc182500184"/>
           <w:r>
             <w:rPr>
               <w:rFonts w:eastAsiaTheme="minorEastAsia" w:cstheme="minorBidi"/>
@@ -24528,7 +25020,7 @@
             </w:rPr>
             <w:t>"</w:t>
           </w:r>
-          <w:bookmarkEnd w:id="198"/>
+          <w:bookmarkEnd w:id="197"/>
         </w:p>
         <w:p/>
       </w:sdtContent>
@@ -24540,18 +25032,18 @@
           <w:b w:val="0"/>
         </w:rPr>
       </w:pPr>
-      <w:bookmarkStart w:id="199" w:name="_Toc49341898"/>
-      <w:bookmarkStart w:id="200" w:name="_Toc182219002"/>
-      <w:bookmarkStart w:id="201" w:name="_Toc182500185"/>
+      <w:bookmarkStart w:id="198" w:name="_Toc49341898"/>
+      <w:bookmarkStart w:id="199" w:name="_Toc182219002"/>
+      <w:bookmarkStart w:id="200" w:name="_Toc182500185"/>
       <w:r>
         <w:rPr>
           <w:b w:val="0"/>
         </w:rPr>
         <w:t>Ejemplo de formulario de satisfacción</w:t>
       </w:r>
+      <w:bookmarkEnd w:id="198"/>
       <w:bookmarkEnd w:id="199"/>
       <w:bookmarkEnd w:id="200"/>
-      <w:bookmarkEnd w:id="201"/>
     </w:p>
     <w:p>
       <w:r>
@@ -27313,8 +27805,8 @@
           <w:b w:val="0"/>
         </w:rPr>
       </w:pPr>
-      <w:bookmarkStart w:id="202" w:name="_Toc182219003"/>
-      <w:bookmarkStart w:id="203" w:name="_Toc182500186"/>
+      <w:bookmarkStart w:id="201" w:name="_Toc182219003"/>
+      <w:bookmarkStart w:id="202" w:name="_Toc182500186"/>
       <w:r>
         <w:rPr>
           <w:b w:val="0"/>
@@ -27322,8 +27814,8 @@
         <w:lastRenderedPageBreak/>
         <w:t>Datos de prueba</w:t>
       </w:r>
+      <w:bookmarkEnd w:id="201"/>
       <w:bookmarkEnd w:id="202"/>
-      <w:bookmarkEnd w:id="203"/>
     </w:p>
     <w:p>
       <w:pPr>
@@ -33063,6 +33555,95 @@
     </w:lvl>
   </w:abstractNum>
   <w:abstractNum w:abstractNumId="2" w15:restartNumberingAfterBreak="0">
+    <w:nsid w:val="1ABD73BB"/>
+    <w:multiLevelType w:val="hybridMultilevel"/>
+    <w:tmpl w:val="626E7174"/>
+    <w:lvl w:ilvl="0" w:tplc="0C0A000F">
+      <w:start w:val="1"/>
+      <w:numFmt w:val="decimal"/>
+      <w:lvlText w:val="%1."/>
+      <w:lvlJc w:val="left"/>
+      <w:pPr>
+        <w:ind w:left="720" w:hanging="360"/>
+      </w:pPr>
+      <w:rPr>
+        <w:rFonts w:hint="default"/>
+      </w:rPr>
+    </w:lvl>
+    <w:lvl w:ilvl="1" w:tplc="0C0A0019" w:tentative="1">
+      <w:start w:val="1"/>
+      <w:numFmt w:val="lowerLetter"/>
+      <w:lvlText w:val="%2."/>
+      <w:lvlJc w:val="left"/>
+      <w:pPr>
+        <w:ind w:left="1440" w:hanging="360"/>
+      </w:pPr>
+    </w:lvl>
+    <w:lvl w:ilvl="2" w:tplc="0C0A001B" w:tentative="1">
+      <w:start w:val="1"/>
+      <w:numFmt w:val="lowerRoman"/>
+      <w:lvlText w:val="%3."/>
+      <w:lvlJc w:val="right"/>
+      <w:pPr>
+        <w:ind w:left="2160" w:hanging="180"/>
+      </w:pPr>
+    </w:lvl>
+    <w:lvl w:ilvl="3" w:tplc="0C0A000F" w:tentative="1">
+      <w:start w:val="1"/>
+      <w:numFmt w:val="decimal"/>
+      <w:lvlText w:val="%4."/>
+      <w:lvlJc w:val="left"/>
+      <w:pPr>
+        <w:ind w:left="2880" w:hanging="360"/>
+      </w:pPr>
+    </w:lvl>
+    <w:lvl w:ilvl="4" w:tplc="0C0A0019" w:tentative="1">
+      <w:start w:val="1"/>
+      <w:numFmt w:val="lowerLetter"/>
+      <w:lvlText w:val="%5."/>
+      <w:lvlJc w:val="left"/>
+      <w:pPr>
+        <w:ind w:left="3600" w:hanging="360"/>
+      </w:pPr>
+    </w:lvl>
+    <w:lvl w:ilvl="5" w:tplc="0C0A001B" w:tentative="1">
+      <w:start w:val="1"/>
+      <w:numFmt w:val="lowerRoman"/>
+      <w:lvlText w:val="%6."/>
+      <w:lvlJc w:val="right"/>
+      <w:pPr>
+        <w:ind w:left="4320" w:hanging="180"/>
+      </w:pPr>
+    </w:lvl>
+    <w:lvl w:ilvl="6" w:tplc="0C0A000F" w:tentative="1">
+      <w:start w:val="1"/>
+      <w:numFmt w:val="decimal"/>
+      <w:lvlText w:val="%7."/>
+      <w:lvlJc w:val="left"/>
+      <w:pPr>
+        <w:ind w:left="5040" w:hanging="360"/>
+      </w:pPr>
+    </w:lvl>
+    <w:lvl w:ilvl="7" w:tplc="0C0A0019" w:tentative="1">
+      <w:start w:val="1"/>
+      <w:numFmt w:val="lowerLetter"/>
+      <w:lvlText w:val="%8."/>
+      <w:lvlJc w:val="left"/>
+      <w:pPr>
+        <w:ind w:left="5760" w:hanging="360"/>
+      </w:pPr>
+    </w:lvl>
+    <w:lvl w:ilvl="8" w:tplc="0C0A001B" w:tentative="1">
+      <w:start w:val="1"/>
+      <w:numFmt w:val="lowerRoman"/>
+      <w:lvlText w:val="%9."/>
+      <w:lvlJc w:val="right"/>
+      <w:pPr>
+        <w:ind w:left="6480" w:hanging="180"/>
+      </w:pPr>
+    </w:lvl>
+  </w:abstractNum>
+  <w:abstractNum w:abstractNumId="3" w15:restartNumberingAfterBreak="0">
     <w:nsid w:val="1BC0572C"/>
     <w:multiLevelType w:val="hybridMultilevel"/>
     <w:tmpl w:val="8580F39E"/>
@@ -33175,7 +33756,7 @@
       </w:rPr>
     </w:lvl>
   </w:abstractNum>
-  <w:abstractNum w:abstractNumId="3" w15:restartNumberingAfterBreak="0">
+  <w:abstractNum w:abstractNumId="4" w15:restartNumberingAfterBreak="0">
     <w:nsid w:val="30031545"/>
     <w:multiLevelType w:val="hybridMultilevel"/>
     <w:tmpl w:val="3A9E44FA"/>
@@ -33288,7 +33869,7 @@
       </w:rPr>
     </w:lvl>
   </w:abstractNum>
-  <w:abstractNum w:abstractNumId="4" w15:restartNumberingAfterBreak="0">
+  <w:abstractNum w:abstractNumId="5" w15:restartNumberingAfterBreak="0">
     <w:nsid w:val="408734B4"/>
     <w:multiLevelType w:val="hybridMultilevel"/>
     <w:tmpl w:val="2D56C700"/>
@@ -33401,7 +33982,7 @@
       </w:rPr>
     </w:lvl>
   </w:abstractNum>
-  <w:abstractNum w:abstractNumId="5" w15:restartNumberingAfterBreak="0">
+  <w:abstractNum w:abstractNumId="6" w15:restartNumberingAfterBreak="0">
     <w:nsid w:val="415F2157"/>
     <w:multiLevelType w:val="hybridMultilevel"/>
     <w:tmpl w:val="8C52AE3E"/>
@@ -33514,7 +34095,7 @@
       </w:rPr>
     </w:lvl>
   </w:abstractNum>
-  <w:abstractNum w:abstractNumId="6" w15:restartNumberingAfterBreak="0">
+  <w:abstractNum w:abstractNumId="7" w15:restartNumberingAfterBreak="0">
     <w:nsid w:val="46D2207E"/>
     <w:multiLevelType w:val="hybridMultilevel"/>
     <w:tmpl w:val="7F6A73AA"/>
@@ -33627,7 +34208,7 @@
       </w:rPr>
     </w:lvl>
   </w:abstractNum>
-  <w:abstractNum w:abstractNumId="7" w15:restartNumberingAfterBreak="0">
+  <w:abstractNum w:abstractNumId="8" w15:restartNumberingAfterBreak="0">
     <w:nsid w:val="49174A88"/>
     <w:multiLevelType w:val="hybridMultilevel"/>
     <w:tmpl w:val="A3DEF222"/>
@@ -33740,7 +34321,7 @@
       </w:rPr>
     </w:lvl>
   </w:abstractNum>
-  <w:abstractNum w:abstractNumId="8" w15:restartNumberingAfterBreak="0">
+  <w:abstractNum w:abstractNumId="9" w15:restartNumberingAfterBreak="0">
     <w:nsid w:val="4C27462A"/>
     <w:multiLevelType w:val="hybridMultilevel"/>
     <w:tmpl w:val="D5AE26E6"/>
@@ -33853,7 +34434,7 @@
       </w:rPr>
     </w:lvl>
   </w:abstractNum>
-  <w:abstractNum w:abstractNumId="9" w15:restartNumberingAfterBreak="0">
+  <w:abstractNum w:abstractNumId="10" w15:restartNumberingAfterBreak="0">
     <w:nsid w:val="54E76D80"/>
     <w:multiLevelType w:val="hybridMultilevel"/>
     <w:tmpl w:val="4CAAA5CC"/>
@@ -33966,7 +34547,7 @@
       </w:rPr>
     </w:lvl>
   </w:abstractNum>
-  <w:abstractNum w:abstractNumId="10" w15:restartNumberingAfterBreak="0">
+  <w:abstractNum w:abstractNumId="11" w15:restartNumberingAfterBreak="0">
     <w:nsid w:val="56DC0F4F"/>
     <w:multiLevelType w:val="hybridMultilevel"/>
     <w:tmpl w:val="DBDE6AE6"/>
@@ -34079,7 +34660,7 @@
       </w:rPr>
     </w:lvl>
   </w:abstractNum>
-  <w:abstractNum w:abstractNumId="11" w15:restartNumberingAfterBreak="0">
+  <w:abstractNum w:abstractNumId="12" w15:restartNumberingAfterBreak="0">
     <w:nsid w:val="584108BF"/>
     <w:multiLevelType w:val="hybridMultilevel"/>
     <w:tmpl w:val="720A6B12"/>
@@ -34192,7 +34773,7 @@
       </w:rPr>
     </w:lvl>
   </w:abstractNum>
-  <w:abstractNum w:abstractNumId="12" w15:restartNumberingAfterBreak="0">
+  <w:abstractNum w:abstractNumId="13" w15:restartNumberingAfterBreak="0">
     <w:nsid w:val="780E04D7"/>
     <w:multiLevelType w:val="hybridMultilevel"/>
     <w:tmpl w:val="AAA02FD2"/>
@@ -34305,7 +34886,7 @@
       </w:rPr>
     </w:lvl>
   </w:abstractNum>
-  <w:abstractNum w:abstractNumId="13" w15:restartNumberingAfterBreak="0">
+  <w:abstractNum w:abstractNumId="14" w15:restartNumberingAfterBreak="0">
     <w:nsid w:val="79306B18"/>
     <w:multiLevelType w:val="hybridMultilevel"/>
     <w:tmpl w:val="B02AD490"/>
@@ -34419,46 +35000,49 @@
     </w:lvl>
   </w:abstractNum>
   <w:num w:numId="1" w16cid:durableId="1264800247">
-    <w:abstractNumId w:val="12"/>
+    <w:abstractNumId w:val="13"/>
   </w:num>
   <w:num w:numId="2" w16cid:durableId="1848666731">
-    <w:abstractNumId w:val="9"/>
+    <w:abstractNumId w:val="10"/>
   </w:num>
   <w:num w:numId="3" w16cid:durableId="556431196">
     <w:abstractNumId w:val="1"/>
   </w:num>
   <w:num w:numId="4" w16cid:durableId="1217467586">
+    <w:abstractNumId w:val="8"/>
+  </w:num>
+  <w:num w:numId="5" w16cid:durableId="620041898">
+    <w:abstractNumId w:val="6"/>
+  </w:num>
+  <w:num w:numId="6" w16cid:durableId="2026710683">
+    <w:abstractNumId w:val="3"/>
+  </w:num>
+  <w:num w:numId="7" w16cid:durableId="1017121877">
+    <w:abstractNumId w:val="12"/>
+  </w:num>
+  <w:num w:numId="8" w16cid:durableId="1962809096">
+    <w:abstractNumId w:val="4"/>
+  </w:num>
+  <w:num w:numId="9" w16cid:durableId="19283992">
     <w:abstractNumId w:val="7"/>
   </w:num>
-  <w:num w:numId="5" w16cid:durableId="620041898">
-    <w:abstractNumId w:val="5"/>
-  </w:num>
-  <w:num w:numId="6" w16cid:durableId="2026710683">
-    <w:abstractNumId w:val="2"/>
-  </w:num>
-  <w:num w:numId="7" w16cid:durableId="1017121877">
+  <w:num w:numId="10" w16cid:durableId="1822650518">
     <w:abstractNumId w:val="11"/>
   </w:num>
-  <w:num w:numId="8" w16cid:durableId="1962809096">
-    <w:abstractNumId w:val="3"/>
-  </w:num>
-  <w:num w:numId="9" w16cid:durableId="19283992">
-    <w:abstractNumId w:val="6"/>
-  </w:num>
-  <w:num w:numId="10" w16cid:durableId="1822650518">
-    <w:abstractNumId w:val="10"/>
-  </w:num>
   <w:num w:numId="11" w16cid:durableId="301691016">
-    <w:abstractNumId w:val="8"/>
+    <w:abstractNumId w:val="9"/>
   </w:num>
   <w:num w:numId="12" w16cid:durableId="517739745">
-    <w:abstractNumId w:val="13"/>
+    <w:abstractNumId w:val="14"/>
   </w:num>
   <w:num w:numId="13" w16cid:durableId="344672934">
     <w:abstractNumId w:val="0"/>
   </w:num>
   <w:num w:numId="14" w16cid:durableId="1212763014">
-    <w:abstractNumId w:val="4"/>
+    <w:abstractNumId w:val="5"/>
+  </w:num>
+  <w:num w:numId="15" w16cid:durableId="264197226">
+    <w:abstractNumId w:val="2"/>
   </w:num>
   <w:numIdMacAtCleanup w:val="9"/>
 </w:numbering>
@@ -34957,7 +35541,6 @@
   <w:style w:type="character" w:default="1" w:styleId="Fuentedeprrafopredeter">
     <w:name w:val="Default Paragraph Font"/>
     <w:uiPriority w:val="1"/>
-    <w:semiHidden/>
     <w:unhideWhenUsed/>
   </w:style>
   <w:style w:type="table" w:default="1" w:styleId="Tablanormal">
@@ -35932,6 +36515,36 @@
       <w:shd w:val="clear" w:color="auto" w:fill="E1DFDD"/>
     </w:rPr>
   </w:style>
+  <w:style w:type="paragraph" w:styleId="HTMLconformatoprevio">
+    <w:name w:val="HTML Preformatted"/>
+    <w:basedOn w:val="Normal"/>
+    <w:link w:val="HTMLconformatoprevioCar"/>
+    <w:uiPriority w:val="99"/>
+    <w:semiHidden/>
+    <w:unhideWhenUsed/>
+    <w:rsid w:val="00563233"/>
+    <w:pPr>
+      <w:spacing w:line="240" w:lineRule="auto"/>
+    </w:pPr>
+    <w:rPr>
+      <w:rFonts w:ascii="Consolas" w:hAnsi="Consolas"/>
+      <w:sz w:val="20"/>
+      <w:szCs w:val="20"/>
+    </w:rPr>
+  </w:style>
+  <w:style w:type="character" w:customStyle="1" w:styleId="HTMLconformatoprevioCar">
+    <w:name w:val="HTML con formato previo Car"/>
+    <w:basedOn w:val="Fuentedeprrafopredeter"/>
+    <w:link w:val="HTMLconformatoprevio"/>
+    <w:uiPriority w:val="99"/>
+    <w:semiHidden/>
+    <w:rsid w:val="00563233"/>
+    <w:rPr>
+      <w:rFonts w:ascii="Consolas" w:eastAsiaTheme="minorEastAsia" w:hAnsi="Consolas"/>
+      <w:sz w:val="20"/>
+      <w:szCs w:val="20"/>
+    </w:rPr>
+  </w:style>
 </w:styles>
 </file>
 
@@ -36216,19 +36829,19 @@
 
 <file path=word/glossary/fontTable.xml><?xml version="1.0" encoding="utf-8"?>
 <w:fonts xmlns:mc="http://schemas.openxmlformats.org/markup-compatibility/2006" xmlns:r="http://schemas.openxmlformats.org/officeDocument/2006/relationships" xmlns:w="http://schemas.openxmlformats.org/wordprocessingml/2006/main" xmlns:w14="http://schemas.microsoft.com/office/word/2010/wordml" xmlns:w15="http://schemas.microsoft.com/office/word/2012/wordml" xmlns:w16cex="http://schemas.microsoft.com/office/word/2018/wordml/cex" xmlns:w16cid="http://schemas.microsoft.com/office/word/2016/wordml/cid" xmlns:w16="http://schemas.microsoft.com/office/word/2018/wordml" xmlns:w16du="http://schemas.microsoft.com/office/word/2023/wordml/word16du" xmlns:w16sdtdh="http://schemas.microsoft.com/office/word/2020/wordml/sdtdatahash" xmlns:w16sdtfl="http://schemas.microsoft.com/office/word/2024/wordml/sdtformatlock" xmlns:w16se="http://schemas.microsoft.com/office/word/2015/wordml/symex" mc:Ignorable="w14 w15 w16se w16cid w16 w16cex w16sdtdh w16sdtfl w16du">
+  <w:font w:name="Times New Roman">
+    <w:panose1 w:val="02020603050405020304"/>
+    <w:charset w:val="00"/>
+    <w:family w:val="roman"/>
+    <w:pitch w:val="variable"/>
+    <w:sig w:usb0="E0002EFF" w:usb1="C000785B" w:usb2="00000009" w:usb3="00000000" w:csb0="000001FF" w:csb1="00000000"/>
+  </w:font>
   <w:font w:name="Symbol">
     <w:panose1 w:val="05050102010706020507"/>
     <w:charset w:val="02"/>
     <w:family w:val="roman"/>
     <w:pitch w:val="variable"/>
     <w:sig w:usb0="00000000" w:usb1="10000000" w:usb2="00000000" w:usb3="00000000" w:csb0="80000000" w:csb1="00000000"/>
-  </w:font>
-  <w:font w:name="Times New Roman">
-    <w:panose1 w:val="02020603050405020304"/>
-    <w:charset w:val="00"/>
-    <w:family w:val="roman"/>
-    <w:pitch w:val="variable"/>
-    <w:sig w:usb0="E0002EFF" w:usb1="C000785B" w:usb2="00000009" w:usb3="00000000" w:csb0="000001FF" w:csb1="00000000"/>
   </w:font>
   <w:font w:name="Courier New">
     <w:panose1 w:val="02070309020205020404"/>
@@ -36279,6 +36892,13 @@
     <w:family w:val="swiss"/>
     <w:pitch w:val="variable"/>
     <w:sig w:usb0="E1002EFF" w:usb1="C000605B" w:usb2="00000029" w:usb3="00000000" w:csb0="000101FF" w:csb1="00000000"/>
+  </w:font>
+  <w:font w:name="Consolas">
+    <w:panose1 w:val="020B0609020204030204"/>
+    <w:charset w:val="00"/>
+    <w:family w:val="modern"/>
+    <w:pitch w:val="fixed"/>
+    <w:sig w:usb0="E00006FF" w:usb1="0000FCFF" w:usb2="00000001" w:usb3="00000000" w:csb0="0000019F" w:csb1="00000000"/>
   </w:font>
   <w:font w:name="Aptos">
     <w:charset w:val="00"/>
@@ -36364,7 +36984,9 @@
     <w:rsid w:val="00626CAC"/>
     <w:rsid w:val="0063227A"/>
     <w:rsid w:val="0066166D"/>
+    <w:rsid w:val="006661D1"/>
     <w:rsid w:val="00684424"/>
+    <w:rsid w:val="00687DCC"/>
     <w:rsid w:val="006A6D69"/>
     <w:rsid w:val="006C7D05"/>
     <w:rsid w:val="00734B22"/>

</xml_diff>